<commit_message>
added reflective statement to report
</commit_message>
<xml_diff>
--- a/docs/Employee_Retention_Predictor_Capstone_Report_drafting.docx
+++ b/docs/Employee_Retention_Predictor_Capstone_Report_drafting.docx
@@ -141,6 +141,7 @@
           <w:docPartUnique/>
         </w:docPartObj>
       </w:sdtPr>
+      <w:sdtEndPr/>
       <w:sdtContent>
         <w:p>
           <w:pPr>
@@ -165,7 +166,7 @@
           <w:r>
             <w:fldChar w:fldCharType="separate"/>
           </w:r>
-          <w:hyperlink w:anchor="_Toc240131103" w:history="1">
+          <w:hyperlink w:anchor="_Toc240133357" w:history="1">
             <w:r>
               <w:rPr>
                 <w:rStyle w:val="Hyperlink"/>
@@ -192,7 +193,7 @@
                 <w:noProof/>
                 <w:webHidden/>
               </w:rPr>
-              <w:instrText xml:space="preserve"> PAGEREF _Toc240131103 \h </w:instrText>
+              <w:instrText xml:space="preserve"> PAGEREF _Toc240133357 \h </w:instrText>
             </w:r>
             <w:r>
               <w:rPr>
@@ -237,7 +238,7 @@
               <w14:ligatures w14:val="standardContextual"/>
             </w:rPr>
           </w:pPr>
-          <w:hyperlink w:anchor="_Toc240131104" w:history="1">
+          <w:hyperlink w:anchor="_Toc240133358" w:history="1">
             <w:r>
               <w:rPr>
                 <w:rStyle w:val="Hyperlink"/>
@@ -264,7 +265,7 @@
                 <w:noProof/>
                 <w:webHidden/>
               </w:rPr>
-              <w:instrText xml:space="preserve"> PAGEREF _Toc240131104 \h </w:instrText>
+              <w:instrText xml:space="preserve"> PAGEREF _Toc240133358 \h </w:instrText>
             </w:r>
             <w:r>
               <w:rPr>
@@ -309,7 +310,7 @@
               <w14:ligatures w14:val="standardContextual"/>
             </w:rPr>
           </w:pPr>
-          <w:hyperlink w:anchor="_Toc240131105" w:history="1">
+          <w:hyperlink w:anchor="_Toc240133359" w:history="1">
             <w:r>
               <w:rPr>
                 <w:rStyle w:val="Hyperlink"/>
@@ -336,7 +337,7 @@
                 <w:noProof/>
                 <w:webHidden/>
               </w:rPr>
-              <w:instrText xml:space="preserve"> PAGEREF _Toc240131105 \h </w:instrText>
+              <w:instrText xml:space="preserve"> PAGEREF _Toc240133359 \h </w:instrText>
             </w:r>
             <w:r>
               <w:rPr>
@@ -381,7 +382,7 @@
               <w14:ligatures w14:val="standardContextual"/>
             </w:rPr>
           </w:pPr>
-          <w:hyperlink w:anchor="_Toc240131106" w:history="1">
+          <w:hyperlink w:anchor="_Toc240133360" w:history="1">
             <w:r>
               <w:rPr>
                 <w:rStyle w:val="Hyperlink"/>
@@ -408,7 +409,7 @@
                 <w:noProof/>
                 <w:webHidden/>
               </w:rPr>
-              <w:instrText xml:space="preserve"> PAGEREF _Toc240131106 \h </w:instrText>
+              <w:instrText xml:space="preserve"> PAGEREF _Toc240133360 \h </w:instrText>
             </w:r>
             <w:r>
               <w:rPr>
@@ -453,7 +454,7 @@
               <w14:ligatures w14:val="standardContextual"/>
             </w:rPr>
           </w:pPr>
-          <w:hyperlink w:anchor="_Toc240131107" w:history="1">
+          <w:hyperlink w:anchor="_Toc240133361" w:history="1">
             <w:r>
               <w:rPr>
                 <w:rStyle w:val="Hyperlink"/>
@@ -480,7 +481,7 @@
                 <w:noProof/>
                 <w:webHidden/>
               </w:rPr>
-              <w:instrText xml:space="preserve"> PAGEREF _Toc240131107 \h </w:instrText>
+              <w:instrText xml:space="preserve"> PAGEREF _Toc240133361 \h </w:instrText>
             </w:r>
             <w:r>
               <w:rPr>
@@ -525,7 +526,7 @@
               <w14:ligatures w14:val="standardContextual"/>
             </w:rPr>
           </w:pPr>
-          <w:hyperlink w:anchor="_Toc240131108" w:history="1">
+          <w:hyperlink w:anchor="_Toc240133362" w:history="1">
             <w:r>
               <w:rPr>
                 <w:rStyle w:val="Hyperlink"/>
@@ -552,7 +553,7 @@
                 <w:noProof/>
                 <w:webHidden/>
               </w:rPr>
-              <w:instrText xml:space="preserve"> PAGEREF _Toc240131108 \h </w:instrText>
+              <w:instrText xml:space="preserve"> PAGEREF _Toc240133362 \h </w:instrText>
             </w:r>
             <w:r>
               <w:rPr>
@@ -597,7 +598,7 @@
               <w14:ligatures w14:val="standardContextual"/>
             </w:rPr>
           </w:pPr>
-          <w:hyperlink w:anchor="_Toc240131109" w:history="1">
+          <w:hyperlink w:anchor="_Toc240133363" w:history="1">
             <w:r>
               <w:rPr>
                 <w:rStyle w:val="Hyperlink"/>
@@ -624,7 +625,7 @@
                 <w:noProof/>
                 <w:webHidden/>
               </w:rPr>
-              <w:instrText xml:space="preserve"> PAGEREF _Toc240131109 \h </w:instrText>
+              <w:instrText xml:space="preserve"> PAGEREF _Toc240133363 \h </w:instrText>
             </w:r>
             <w:r>
               <w:rPr>
@@ -669,7 +670,7 @@
               <w14:ligatures w14:val="standardContextual"/>
             </w:rPr>
           </w:pPr>
-          <w:hyperlink w:anchor="_Toc240131110" w:history="1">
+          <w:hyperlink w:anchor="_Toc240133364" w:history="1">
             <w:r>
               <w:rPr>
                 <w:rStyle w:val="Hyperlink"/>
@@ -696,7 +697,7 @@
                 <w:noProof/>
                 <w:webHidden/>
               </w:rPr>
-              <w:instrText xml:space="preserve"> PAGEREF _Toc240131110 \h </w:instrText>
+              <w:instrText xml:space="preserve"> PAGEREF _Toc240133364 \h </w:instrText>
             </w:r>
             <w:r>
               <w:rPr>
@@ -741,7 +742,7 @@
               <w14:ligatures w14:val="standardContextual"/>
             </w:rPr>
           </w:pPr>
-          <w:hyperlink w:anchor="_Toc240131111" w:history="1">
+          <w:hyperlink w:anchor="_Toc240133365" w:history="1">
             <w:r>
               <w:rPr>
                 <w:rStyle w:val="Hyperlink"/>
@@ -768,7 +769,7 @@
                 <w:noProof/>
                 <w:webHidden/>
               </w:rPr>
-              <w:instrText xml:space="preserve"> PAGEREF _Toc240131111 \h </w:instrText>
+              <w:instrText xml:space="preserve"> PAGEREF _Toc240133365 \h </w:instrText>
             </w:r>
             <w:r>
               <w:rPr>
@@ -813,7 +814,7 @@
               <w14:ligatures w14:val="standardContextual"/>
             </w:rPr>
           </w:pPr>
-          <w:hyperlink w:anchor="_Toc240131112" w:history="1">
+          <w:hyperlink w:anchor="_Toc240133366" w:history="1">
             <w:r>
               <w:rPr>
                 <w:rStyle w:val="Hyperlink"/>
@@ -840,7 +841,7 @@
                 <w:noProof/>
                 <w:webHidden/>
               </w:rPr>
-              <w:instrText xml:space="preserve"> PAGEREF _Toc240131112 \h </w:instrText>
+              <w:instrText xml:space="preserve"> PAGEREF _Toc240133366 \h </w:instrText>
             </w:r>
             <w:r>
               <w:rPr>
@@ -885,7 +886,7 @@
               <w14:ligatures w14:val="standardContextual"/>
             </w:rPr>
           </w:pPr>
-          <w:hyperlink w:anchor="_Toc240131113" w:history="1">
+          <w:hyperlink w:anchor="_Toc240133367" w:history="1">
             <w:r>
               <w:rPr>
                 <w:rStyle w:val="Hyperlink"/>
@@ -912,7 +913,7 @@
                 <w:noProof/>
                 <w:webHidden/>
               </w:rPr>
-              <w:instrText xml:space="preserve"> PAGEREF _Toc240131113 \h </w:instrText>
+              <w:instrText xml:space="preserve"> PAGEREF _Toc240133367 \h </w:instrText>
             </w:r>
             <w:r>
               <w:rPr>
@@ -957,7 +958,7 @@
               <w14:ligatures w14:val="standardContextual"/>
             </w:rPr>
           </w:pPr>
-          <w:hyperlink w:anchor="_Toc240131114" w:history="1">
+          <w:hyperlink w:anchor="_Toc240133368" w:history="1">
             <w:r>
               <w:rPr>
                 <w:rStyle w:val="Hyperlink"/>
@@ -984,7 +985,7 @@
                 <w:noProof/>
                 <w:webHidden/>
               </w:rPr>
-              <w:instrText xml:space="preserve"> PAGEREF _Toc240131114 \h </w:instrText>
+              <w:instrText xml:space="preserve"> PAGEREF _Toc240133368 \h </w:instrText>
             </w:r>
             <w:r>
               <w:rPr>
@@ -1029,7 +1030,7 @@
               <w14:ligatures w14:val="standardContextual"/>
             </w:rPr>
           </w:pPr>
-          <w:hyperlink w:anchor="_Toc240131115" w:history="1">
+          <w:hyperlink w:anchor="_Toc240133369" w:history="1">
             <w:r>
               <w:rPr>
                 <w:rStyle w:val="Hyperlink"/>
@@ -1056,7 +1057,7 @@
                 <w:noProof/>
                 <w:webHidden/>
               </w:rPr>
-              <w:instrText xml:space="preserve"> PAGEREF _Toc240131115 \h </w:instrText>
+              <w:instrText xml:space="preserve"> PAGEREF _Toc240133369 \h </w:instrText>
             </w:r>
             <w:r>
               <w:rPr>
@@ -1101,7 +1102,7 @@
               <w14:ligatures w14:val="standardContextual"/>
             </w:rPr>
           </w:pPr>
-          <w:hyperlink w:anchor="_Toc240131116" w:history="1">
+          <w:hyperlink w:anchor="_Toc240133370" w:history="1">
             <w:r>
               <w:rPr>
                 <w:rStyle w:val="Hyperlink"/>
@@ -1128,7 +1129,7 @@
                 <w:noProof/>
                 <w:webHidden/>
               </w:rPr>
-              <w:instrText xml:space="preserve"> PAGEREF _Toc240131116 \h </w:instrText>
+              <w:instrText xml:space="preserve"> PAGEREF _Toc240133370 \h </w:instrText>
             </w:r>
             <w:r>
               <w:rPr>
@@ -1173,7 +1174,7 @@
               <w14:ligatures w14:val="standardContextual"/>
             </w:rPr>
           </w:pPr>
-          <w:hyperlink w:anchor="_Toc240131117" w:history="1">
+          <w:hyperlink w:anchor="_Toc240133371" w:history="1">
             <w:r>
               <w:rPr>
                 <w:rStyle w:val="Hyperlink"/>
@@ -1200,7 +1201,7 @@
                 <w:noProof/>
                 <w:webHidden/>
               </w:rPr>
-              <w:instrText xml:space="preserve"> PAGEREF _Toc240131117 \h </w:instrText>
+              <w:instrText xml:space="preserve"> PAGEREF _Toc240133371 \h </w:instrText>
             </w:r>
             <w:r>
               <w:rPr>
@@ -1245,7 +1246,7 @@
               <w14:ligatures w14:val="standardContextual"/>
             </w:rPr>
           </w:pPr>
-          <w:hyperlink w:anchor="_Toc240131118" w:history="1">
+          <w:hyperlink w:anchor="_Toc240133372" w:history="1">
             <w:r>
               <w:rPr>
                 <w:rStyle w:val="Hyperlink"/>
@@ -1272,7 +1273,7 @@
                 <w:noProof/>
                 <w:webHidden/>
               </w:rPr>
-              <w:instrText xml:space="preserve"> PAGEREF _Toc240131118 \h </w:instrText>
+              <w:instrText xml:space="preserve"> PAGEREF _Toc240133372 \h </w:instrText>
             </w:r>
             <w:r>
               <w:rPr>
@@ -1317,7 +1318,7 @@
               <w14:ligatures w14:val="standardContextual"/>
             </w:rPr>
           </w:pPr>
-          <w:hyperlink w:anchor="_Toc240131119" w:history="1">
+          <w:hyperlink w:anchor="_Toc240133373" w:history="1">
             <w:r>
               <w:rPr>
                 <w:rStyle w:val="Hyperlink"/>
@@ -1344,7 +1345,7 @@
                 <w:noProof/>
                 <w:webHidden/>
               </w:rPr>
-              <w:instrText xml:space="preserve"> PAGEREF _Toc240131119 \h </w:instrText>
+              <w:instrText xml:space="preserve"> PAGEREF _Toc240133373 \h </w:instrText>
             </w:r>
             <w:r>
               <w:rPr>
@@ -1389,7 +1390,7 @@
               <w14:ligatures w14:val="standardContextual"/>
             </w:rPr>
           </w:pPr>
-          <w:hyperlink w:anchor="_Toc240131120" w:history="1">
+          <w:hyperlink w:anchor="_Toc240133374" w:history="1">
             <w:r>
               <w:rPr>
                 <w:rStyle w:val="Hyperlink"/>
@@ -1416,7 +1417,7 @@
                 <w:noProof/>
                 <w:webHidden/>
               </w:rPr>
-              <w:instrText xml:space="preserve"> PAGEREF _Toc240131120 \h </w:instrText>
+              <w:instrText xml:space="preserve"> PAGEREF _Toc240133374 \h </w:instrText>
             </w:r>
             <w:r>
               <w:rPr>
@@ -1461,7 +1462,7 @@
               <w14:ligatures w14:val="standardContextual"/>
             </w:rPr>
           </w:pPr>
-          <w:hyperlink w:anchor="_Toc240131121" w:history="1">
+          <w:hyperlink w:anchor="_Toc240133375" w:history="1">
             <w:r>
               <w:rPr>
                 <w:rStyle w:val="Hyperlink"/>
@@ -1488,7 +1489,7 @@
                 <w:noProof/>
                 <w:webHidden/>
               </w:rPr>
-              <w:instrText xml:space="preserve"> PAGEREF _Toc240131121 \h </w:instrText>
+              <w:instrText xml:space="preserve"> PAGEREF _Toc240133375 \h </w:instrText>
             </w:r>
             <w:r>
               <w:rPr>
@@ -1533,7 +1534,7 @@
               <w14:ligatures w14:val="standardContextual"/>
             </w:rPr>
           </w:pPr>
-          <w:hyperlink w:anchor="_Toc240131122" w:history="1">
+          <w:hyperlink w:anchor="_Toc240133376" w:history="1">
             <w:r>
               <w:rPr>
                 <w:rStyle w:val="Hyperlink"/>
@@ -1560,7 +1561,7 @@
                 <w:noProof/>
                 <w:webHidden/>
               </w:rPr>
-              <w:instrText xml:space="preserve"> PAGEREF _Toc240131122 \h </w:instrText>
+              <w:instrText xml:space="preserve"> PAGEREF _Toc240133376 \h </w:instrText>
             </w:r>
             <w:r>
               <w:rPr>
@@ -1605,7 +1606,7 @@
               <w14:ligatures w14:val="standardContextual"/>
             </w:rPr>
           </w:pPr>
-          <w:hyperlink w:anchor="_Toc240131123" w:history="1">
+          <w:hyperlink w:anchor="_Toc240133377" w:history="1">
             <w:r>
               <w:rPr>
                 <w:rStyle w:val="Hyperlink"/>
@@ -1632,7 +1633,7 @@
                 <w:noProof/>
                 <w:webHidden/>
               </w:rPr>
-              <w:instrText xml:space="preserve"> PAGEREF _Toc240131123 \h </w:instrText>
+              <w:instrText xml:space="preserve"> PAGEREF _Toc240133377 \h </w:instrText>
             </w:r>
             <w:r>
               <w:rPr>
@@ -1677,7 +1678,7 @@
               <w14:ligatures w14:val="standardContextual"/>
             </w:rPr>
           </w:pPr>
-          <w:hyperlink w:anchor="_Toc240131124" w:history="1">
+          <w:hyperlink w:anchor="_Toc240133378" w:history="1">
             <w:r>
               <w:rPr>
                 <w:rStyle w:val="Hyperlink"/>
@@ -1704,7 +1705,7 @@
                 <w:noProof/>
                 <w:webHidden/>
               </w:rPr>
-              <w:instrText xml:space="preserve"> PAGEREF _Toc240131124 \h </w:instrText>
+              <w:instrText xml:space="preserve"> PAGEREF _Toc240133378 \h </w:instrText>
             </w:r>
             <w:r>
               <w:rPr>
@@ -1749,7 +1750,7 @@
               <w14:ligatures w14:val="standardContextual"/>
             </w:rPr>
           </w:pPr>
-          <w:hyperlink w:anchor="_Toc240131125" w:history="1">
+          <w:hyperlink w:anchor="_Toc240133379" w:history="1">
             <w:r>
               <w:rPr>
                 <w:rStyle w:val="Hyperlink"/>
@@ -1776,7 +1777,7 @@
                 <w:noProof/>
                 <w:webHidden/>
               </w:rPr>
-              <w:instrText xml:space="preserve"> PAGEREF _Toc240131125 \h </w:instrText>
+              <w:instrText xml:space="preserve"> PAGEREF _Toc240133379 \h </w:instrText>
             </w:r>
             <w:r>
               <w:rPr>
@@ -1821,7 +1822,7 @@
               <w14:ligatures w14:val="standardContextual"/>
             </w:rPr>
           </w:pPr>
-          <w:hyperlink w:anchor="_Toc240131126" w:history="1">
+          <w:hyperlink w:anchor="_Toc240133380" w:history="1">
             <w:r>
               <w:rPr>
                 <w:rStyle w:val="Hyperlink"/>
@@ -1848,7 +1849,7 @@
                 <w:noProof/>
                 <w:webHidden/>
               </w:rPr>
-              <w:instrText xml:space="preserve"> PAGEREF _Toc240131126 \h </w:instrText>
+              <w:instrText xml:space="preserve"> PAGEREF _Toc240133380 \h </w:instrText>
             </w:r>
             <w:r>
               <w:rPr>
@@ -1893,7 +1894,7 @@
               <w14:ligatures w14:val="standardContextual"/>
             </w:rPr>
           </w:pPr>
-          <w:hyperlink w:anchor="_Toc240131127" w:history="1">
+          <w:hyperlink w:anchor="_Toc240133381" w:history="1">
             <w:r>
               <w:rPr>
                 <w:rStyle w:val="Hyperlink"/>
@@ -1920,7 +1921,7 @@
                 <w:noProof/>
                 <w:webHidden/>
               </w:rPr>
-              <w:instrText xml:space="preserve"> PAGEREF _Toc240131127 \h </w:instrText>
+              <w:instrText xml:space="preserve"> PAGEREF _Toc240133381 \h </w:instrText>
             </w:r>
             <w:r>
               <w:rPr>
@@ -1965,7 +1966,7 @@
               <w14:ligatures w14:val="standardContextual"/>
             </w:rPr>
           </w:pPr>
-          <w:hyperlink w:anchor="_Toc240131128" w:history="1">
+          <w:hyperlink w:anchor="_Toc240133382" w:history="1">
             <w:r>
               <w:rPr>
                 <w:rStyle w:val="Hyperlink"/>
@@ -1992,7 +1993,7 @@
                 <w:noProof/>
                 <w:webHidden/>
               </w:rPr>
-              <w:instrText xml:space="preserve"> PAGEREF _Toc240131128 \h </w:instrText>
+              <w:instrText xml:space="preserve"> PAGEREF _Toc240133382 \h </w:instrText>
             </w:r>
             <w:r>
               <w:rPr>
@@ -2037,7 +2038,7 @@
               <w14:ligatures w14:val="standardContextual"/>
             </w:rPr>
           </w:pPr>
-          <w:hyperlink w:anchor="_Toc240131129" w:history="1">
+          <w:hyperlink w:anchor="_Toc240133383" w:history="1">
             <w:r>
               <w:rPr>
                 <w:rStyle w:val="Hyperlink"/>
@@ -2064,7 +2065,7 @@
                 <w:noProof/>
                 <w:webHidden/>
               </w:rPr>
-              <w:instrText xml:space="preserve"> PAGEREF _Toc240131129 \h </w:instrText>
+              <w:instrText xml:space="preserve"> PAGEREF _Toc240133383 \h </w:instrText>
             </w:r>
             <w:r>
               <w:rPr>
@@ -2109,7 +2110,7 @@
               <w14:ligatures w14:val="standardContextual"/>
             </w:rPr>
           </w:pPr>
-          <w:hyperlink w:anchor="_Toc240131130" w:history="1">
+          <w:hyperlink w:anchor="_Toc240133384" w:history="1">
             <w:r>
               <w:rPr>
                 <w:rStyle w:val="Hyperlink"/>
@@ -2136,7 +2137,7 @@
                 <w:noProof/>
                 <w:webHidden/>
               </w:rPr>
-              <w:instrText xml:space="preserve"> PAGEREF _Toc240131130 \h </w:instrText>
+              <w:instrText xml:space="preserve"> PAGEREF _Toc240133384 \h </w:instrText>
             </w:r>
             <w:r>
               <w:rPr>
@@ -2181,7 +2182,7 @@
               <w14:ligatures w14:val="standardContextual"/>
             </w:rPr>
           </w:pPr>
-          <w:hyperlink w:anchor="_Toc240131131" w:history="1">
+          <w:hyperlink w:anchor="_Toc240133385" w:history="1">
             <w:r>
               <w:rPr>
                 <w:rStyle w:val="Hyperlink"/>
@@ -2208,7 +2209,7 @@
                 <w:noProof/>
                 <w:webHidden/>
               </w:rPr>
-              <w:instrText xml:space="preserve"> PAGEREF _Toc240131131 \h </w:instrText>
+              <w:instrText xml:space="preserve"> PAGEREF _Toc240133385 \h </w:instrText>
             </w:r>
             <w:r>
               <w:rPr>
@@ -2253,7 +2254,7 @@
               <w14:ligatures w14:val="standardContextual"/>
             </w:rPr>
           </w:pPr>
-          <w:hyperlink w:anchor="_Toc240131132" w:history="1">
+          <w:hyperlink w:anchor="_Toc240133386" w:history="1">
             <w:r>
               <w:rPr>
                 <w:rStyle w:val="Hyperlink"/>
@@ -2280,7 +2281,7 @@
                 <w:noProof/>
                 <w:webHidden/>
               </w:rPr>
-              <w:instrText xml:space="preserve"> PAGEREF _Toc240131132 \h </w:instrText>
+              <w:instrText xml:space="preserve"> PAGEREF _Toc240133386 \h </w:instrText>
             </w:r>
             <w:r>
               <w:rPr>
@@ -2325,7 +2326,7 @@
               <w14:ligatures w14:val="standardContextual"/>
             </w:rPr>
           </w:pPr>
-          <w:hyperlink w:anchor="_Toc240131133" w:history="1">
+          <w:hyperlink w:anchor="_Toc240133387" w:history="1">
             <w:r>
               <w:rPr>
                 <w:rStyle w:val="Hyperlink"/>
@@ -2352,7 +2353,7 @@
                 <w:noProof/>
                 <w:webHidden/>
               </w:rPr>
-              <w:instrText xml:space="preserve"> PAGEREF _Toc240131133 \h </w:instrText>
+              <w:instrText xml:space="preserve"> PAGEREF _Toc240133387 \h </w:instrText>
             </w:r>
             <w:r>
               <w:rPr>
@@ -2397,7 +2398,7 @@
               <w14:ligatures w14:val="standardContextual"/>
             </w:rPr>
           </w:pPr>
-          <w:hyperlink w:anchor="_Toc240131134" w:history="1">
+          <w:hyperlink w:anchor="_Toc240133388" w:history="1">
             <w:r>
               <w:rPr>
                 <w:rStyle w:val="Hyperlink"/>
@@ -2424,7 +2425,7 @@
                 <w:noProof/>
                 <w:webHidden/>
               </w:rPr>
-              <w:instrText xml:space="preserve"> PAGEREF _Toc240131134 \h </w:instrText>
+              <w:instrText xml:space="preserve"> PAGEREF _Toc240133388 \h </w:instrText>
             </w:r>
             <w:r>
               <w:rPr>
@@ -2469,7 +2470,7 @@
               <w14:ligatures w14:val="standardContextual"/>
             </w:rPr>
           </w:pPr>
-          <w:hyperlink w:anchor="_Toc240131135" w:history="1">
+          <w:hyperlink w:anchor="_Toc240133389" w:history="1">
             <w:r>
               <w:rPr>
                 <w:rStyle w:val="Hyperlink"/>
@@ -2496,7 +2497,7 @@
                 <w:noProof/>
                 <w:webHidden/>
               </w:rPr>
-              <w:instrText xml:space="preserve"> PAGEREF _Toc240131135 \h </w:instrText>
+              <w:instrText xml:space="preserve"> PAGEREF _Toc240133389 \h </w:instrText>
             </w:r>
             <w:r>
               <w:rPr>
@@ -2541,7 +2542,7 @@
               <w14:ligatures w14:val="standardContextual"/>
             </w:rPr>
           </w:pPr>
-          <w:hyperlink w:anchor="_Toc240131136" w:history="1">
+          <w:hyperlink w:anchor="_Toc240133390" w:history="1">
             <w:r>
               <w:rPr>
                 <w:rStyle w:val="Hyperlink"/>
@@ -2568,7 +2569,7 @@
                 <w:noProof/>
                 <w:webHidden/>
               </w:rPr>
-              <w:instrText xml:space="preserve"> PAGEREF _Toc240131136 \h </w:instrText>
+              <w:instrText xml:space="preserve"> PAGEREF _Toc240133390 \h </w:instrText>
             </w:r>
             <w:r>
               <w:rPr>
@@ -2613,7 +2614,7 @@
               <w14:ligatures w14:val="standardContextual"/>
             </w:rPr>
           </w:pPr>
-          <w:hyperlink w:anchor="_Toc240131137" w:history="1">
+          <w:hyperlink w:anchor="_Toc240133391" w:history="1">
             <w:r>
               <w:rPr>
                 <w:rStyle w:val="Hyperlink"/>
@@ -2640,7 +2641,7 @@
                 <w:noProof/>
                 <w:webHidden/>
               </w:rPr>
-              <w:instrText xml:space="preserve"> PAGEREF _Toc240131137 \h </w:instrText>
+              <w:instrText xml:space="preserve"> PAGEREF _Toc240133391 \h </w:instrText>
             </w:r>
             <w:r>
               <w:rPr>
@@ -2685,7 +2686,7 @@
               <w14:ligatures w14:val="standardContextual"/>
             </w:rPr>
           </w:pPr>
-          <w:hyperlink w:anchor="_Toc240131138" w:history="1">
+          <w:hyperlink w:anchor="_Toc240133392" w:history="1">
             <w:r>
               <w:rPr>
                 <w:rStyle w:val="Hyperlink"/>
@@ -2712,7 +2713,7 @@
                 <w:noProof/>
                 <w:webHidden/>
               </w:rPr>
-              <w:instrText xml:space="preserve"> PAGEREF _Toc240131138 \h </w:instrText>
+              <w:instrText xml:space="preserve"> PAGEREF _Toc240133392 \h </w:instrText>
             </w:r>
             <w:r>
               <w:rPr>
@@ -2757,7 +2758,7 @@
               <w14:ligatures w14:val="standardContextual"/>
             </w:rPr>
           </w:pPr>
-          <w:hyperlink w:anchor="_Toc240131139" w:history="1">
+          <w:hyperlink w:anchor="_Toc240133393" w:history="1">
             <w:r>
               <w:rPr>
                 <w:rStyle w:val="Hyperlink"/>
@@ -2784,7 +2785,7 @@
                 <w:noProof/>
                 <w:webHidden/>
               </w:rPr>
-              <w:instrText xml:space="preserve"> PAGEREF _Toc240131139 \h </w:instrText>
+              <w:instrText xml:space="preserve"> PAGEREF _Toc240133393 \h </w:instrText>
             </w:r>
             <w:r>
               <w:rPr>
@@ -2829,7 +2830,7 @@
               <w14:ligatures w14:val="standardContextual"/>
             </w:rPr>
           </w:pPr>
-          <w:hyperlink w:anchor="_Toc240131140" w:history="1">
+          <w:hyperlink w:anchor="_Toc240133394" w:history="1">
             <w:r>
               <w:rPr>
                 <w:rStyle w:val="Hyperlink"/>
@@ -2856,7 +2857,7 @@
                 <w:noProof/>
                 <w:webHidden/>
               </w:rPr>
-              <w:instrText xml:space="preserve"> PAGEREF _Toc240131140 \h </w:instrText>
+              <w:instrText xml:space="preserve"> PAGEREF _Toc240133394 \h </w:instrText>
             </w:r>
             <w:r>
               <w:rPr>
@@ -2901,7 +2902,7 @@
               <w14:ligatures w14:val="standardContextual"/>
             </w:rPr>
           </w:pPr>
-          <w:hyperlink w:anchor="_Toc240131141" w:history="1">
+          <w:hyperlink w:anchor="_Toc240133395" w:history="1">
             <w:r>
               <w:rPr>
                 <w:rStyle w:val="Hyperlink"/>
@@ -2928,7 +2929,7 @@
                 <w:noProof/>
                 <w:webHidden/>
               </w:rPr>
-              <w:instrText xml:space="preserve"> PAGEREF _Toc240131141 \h </w:instrText>
+              <w:instrText xml:space="preserve"> PAGEREF _Toc240133395 \h </w:instrText>
             </w:r>
             <w:r>
               <w:rPr>
@@ -2973,7 +2974,7 @@
               <w14:ligatures w14:val="standardContextual"/>
             </w:rPr>
           </w:pPr>
-          <w:hyperlink w:anchor="_Toc240131142" w:history="1">
+          <w:hyperlink w:anchor="_Toc240133396" w:history="1">
             <w:r>
               <w:rPr>
                 <w:rStyle w:val="Hyperlink"/>
@@ -3000,7 +3001,7 @@
                 <w:noProof/>
                 <w:webHidden/>
               </w:rPr>
-              <w:instrText xml:space="preserve"> PAGEREF _Toc240131142 \h </w:instrText>
+              <w:instrText xml:space="preserve"> PAGEREF _Toc240133396 \h </w:instrText>
             </w:r>
             <w:r>
               <w:rPr>
@@ -3045,7 +3046,7 @@
               <w14:ligatures w14:val="standardContextual"/>
             </w:rPr>
           </w:pPr>
-          <w:hyperlink w:anchor="_Toc240131143" w:history="1">
+          <w:hyperlink w:anchor="_Toc240133397" w:history="1">
             <w:r>
               <w:rPr>
                 <w:rStyle w:val="Hyperlink"/>
@@ -3072,7 +3073,7 @@
                 <w:noProof/>
                 <w:webHidden/>
               </w:rPr>
-              <w:instrText xml:space="preserve"> PAGEREF _Toc240131143 \h </w:instrText>
+              <w:instrText xml:space="preserve"> PAGEREF _Toc240133397 \h </w:instrText>
             </w:r>
             <w:r>
               <w:rPr>
@@ -3117,7 +3118,7 @@
               <w14:ligatures w14:val="standardContextual"/>
             </w:rPr>
           </w:pPr>
-          <w:hyperlink w:anchor="_Toc240131144" w:history="1">
+          <w:hyperlink w:anchor="_Toc240133398" w:history="1">
             <w:r>
               <w:rPr>
                 <w:rStyle w:val="Hyperlink"/>
@@ -3144,7 +3145,7 @@
                 <w:noProof/>
                 <w:webHidden/>
               </w:rPr>
-              <w:instrText xml:space="preserve"> PAGEREF _Toc240131144 \h </w:instrText>
+              <w:instrText xml:space="preserve"> PAGEREF _Toc240133398 \h </w:instrText>
             </w:r>
             <w:r>
               <w:rPr>
@@ -3189,7 +3190,7 @@
               <w14:ligatures w14:val="standardContextual"/>
             </w:rPr>
           </w:pPr>
-          <w:hyperlink w:anchor="_Toc240131145" w:history="1">
+          <w:hyperlink w:anchor="_Toc240133399" w:history="1">
             <w:r>
               <w:rPr>
                 <w:rStyle w:val="Hyperlink"/>
@@ -3216,7 +3217,7 @@
                 <w:noProof/>
                 <w:webHidden/>
               </w:rPr>
-              <w:instrText xml:space="preserve"> PAGEREF _Toc240131145 \h </w:instrText>
+              <w:instrText xml:space="preserve"> PAGEREF _Toc240133399 \h </w:instrText>
             </w:r>
             <w:r>
               <w:rPr>
@@ -3261,7 +3262,7 @@
               <w14:ligatures w14:val="standardContextual"/>
             </w:rPr>
           </w:pPr>
-          <w:hyperlink w:anchor="_Toc240131146" w:history="1">
+          <w:hyperlink w:anchor="_Toc240133400" w:history="1">
             <w:r>
               <w:rPr>
                 <w:rStyle w:val="Hyperlink"/>
@@ -3288,7 +3289,7 @@
                 <w:noProof/>
                 <w:webHidden/>
               </w:rPr>
-              <w:instrText xml:space="preserve"> PAGEREF _Toc240131146 \h </w:instrText>
+              <w:instrText xml:space="preserve"> PAGEREF _Toc240133400 \h </w:instrText>
             </w:r>
             <w:r>
               <w:rPr>
@@ -3333,7 +3334,7 @@
               <w14:ligatures w14:val="standardContextual"/>
             </w:rPr>
           </w:pPr>
-          <w:hyperlink w:anchor="_Toc240131147" w:history="1">
+          <w:hyperlink w:anchor="_Toc240133401" w:history="1">
             <w:r>
               <w:rPr>
                 <w:rStyle w:val="Hyperlink"/>
@@ -3360,7 +3361,7 @@
                 <w:noProof/>
                 <w:webHidden/>
               </w:rPr>
-              <w:instrText xml:space="preserve"> PAGEREF _Toc240131147 \h </w:instrText>
+              <w:instrText xml:space="preserve"> PAGEREF _Toc240133401 \h </w:instrText>
             </w:r>
             <w:r>
               <w:rPr>
@@ -3405,7 +3406,7 @@
               <w14:ligatures w14:val="standardContextual"/>
             </w:rPr>
           </w:pPr>
-          <w:hyperlink w:anchor="_Toc240131148" w:history="1">
+          <w:hyperlink w:anchor="_Toc240133402" w:history="1">
             <w:r>
               <w:rPr>
                 <w:rStyle w:val="Hyperlink"/>
@@ -3432,7 +3433,7 @@
                 <w:noProof/>
                 <w:webHidden/>
               </w:rPr>
-              <w:instrText xml:space="preserve"> PAGEREF _Toc240131148 \h </w:instrText>
+              <w:instrText xml:space="preserve"> PAGEREF _Toc240133402 \h </w:instrText>
             </w:r>
             <w:r>
               <w:rPr>
@@ -3477,7 +3478,7 @@
               <w14:ligatures w14:val="standardContextual"/>
             </w:rPr>
           </w:pPr>
-          <w:hyperlink w:anchor="_Toc240131149" w:history="1">
+          <w:hyperlink w:anchor="_Toc240133403" w:history="1">
             <w:r>
               <w:rPr>
                 <w:rStyle w:val="Hyperlink"/>
@@ -3504,7 +3505,7 @@
                 <w:noProof/>
                 <w:webHidden/>
               </w:rPr>
-              <w:instrText xml:space="preserve"> PAGEREF _Toc240131149 \h </w:instrText>
+              <w:instrText xml:space="preserve"> PAGEREF _Toc240133403 \h </w:instrText>
             </w:r>
             <w:r>
               <w:rPr>
@@ -3549,7 +3550,7 @@
               <w14:ligatures w14:val="standardContextual"/>
             </w:rPr>
           </w:pPr>
-          <w:hyperlink w:anchor="_Toc240131150" w:history="1">
+          <w:hyperlink w:anchor="_Toc240133404" w:history="1">
             <w:r>
               <w:rPr>
                 <w:rStyle w:val="Hyperlink"/>
@@ -3576,7 +3577,7 @@
                 <w:noProof/>
                 <w:webHidden/>
               </w:rPr>
-              <w:instrText xml:space="preserve"> PAGEREF _Toc240131150 \h </w:instrText>
+              <w:instrText xml:space="preserve"> PAGEREF _Toc240133404 \h </w:instrText>
             </w:r>
             <w:r>
               <w:rPr>
@@ -3621,7 +3622,7 @@
               <w14:ligatures w14:val="standardContextual"/>
             </w:rPr>
           </w:pPr>
-          <w:hyperlink w:anchor="_Toc240131151" w:history="1">
+          <w:hyperlink w:anchor="_Toc240133405" w:history="1">
             <w:r>
               <w:rPr>
                 <w:rStyle w:val="Hyperlink"/>
@@ -3648,7 +3649,7 @@
                 <w:noProof/>
                 <w:webHidden/>
               </w:rPr>
-              <w:instrText xml:space="preserve"> PAGEREF _Toc240131151 \h </w:instrText>
+              <w:instrText xml:space="preserve"> PAGEREF _Toc240133405 \h </w:instrText>
             </w:r>
             <w:r>
               <w:rPr>
@@ -3693,7 +3694,7 @@
               <w14:ligatures w14:val="standardContextual"/>
             </w:rPr>
           </w:pPr>
-          <w:hyperlink w:anchor="_Toc240131152" w:history="1">
+          <w:hyperlink w:anchor="_Toc240133406" w:history="1">
             <w:r>
               <w:rPr>
                 <w:rStyle w:val="Hyperlink"/>
@@ -3720,7 +3721,7 @@
                 <w:noProof/>
                 <w:webHidden/>
               </w:rPr>
-              <w:instrText xml:space="preserve"> PAGEREF _Toc240131152 \h </w:instrText>
+              <w:instrText xml:space="preserve"> PAGEREF _Toc240133406 \h </w:instrText>
             </w:r>
             <w:r>
               <w:rPr>
@@ -3765,7 +3766,7 @@
               <w14:ligatures w14:val="standardContextual"/>
             </w:rPr>
           </w:pPr>
-          <w:hyperlink w:anchor="_Toc240131153" w:history="1">
+          <w:hyperlink w:anchor="_Toc240133407" w:history="1">
             <w:r>
               <w:rPr>
                 <w:rStyle w:val="Hyperlink"/>
@@ -3792,7 +3793,7 @@
                 <w:noProof/>
                 <w:webHidden/>
               </w:rPr>
-              <w:instrText xml:space="preserve"> PAGEREF _Toc240131153 \h </w:instrText>
+              <w:instrText xml:space="preserve"> PAGEREF _Toc240133407 \h </w:instrText>
             </w:r>
             <w:r>
               <w:rPr>
@@ -3837,7 +3838,7 @@
               <w14:ligatures w14:val="standardContextual"/>
             </w:rPr>
           </w:pPr>
-          <w:hyperlink w:anchor="_Toc240131154" w:history="1">
+          <w:hyperlink w:anchor="_Toc240133408" w:history="1">
             <w:r>
               <w:rPr>
                 <w:rStyle w:val="Hyperlink"/>
@@ -3864,7 +3865,7 @@
                 <w:noProof/>
                 <w:webHidden/>
               </w:rPr>
-              <w:instrText xml:space="preserve"> PAGEREF _Toc240131154 \h </w:instrText>
+              <w:instrText xml:space="preserve"> PAGEREF _Toc240133408 \h </w:instrText>
             </w:r>
             <w:r>
               <w:rPr>
@@ -3909,7 +3910,7 @@
               <w14:ligatures w14:val="standardContextual"/>
             </w:rPr>
           </w:pPr>
-          <w:hyperlink w:anchor="_Toc240131155" w:history="1">
+          <w:hyperlink w:anchor="_Toc240133409" w:history="1">
             <w:r>
               <w:rPr>
                 <w:rStyle w:val="Hyperlink"/>
@@ -3936,7 +3937,7 @@
                 <w:noProof/>
                 <w:webHidden/>
               </w:rPr>
-              <w:instrText xml:space="preserve"> PAGEREF _Toc240131155 \h </w:instrText>
+              <w:instrText xml:space="preserve"> PAGEREF _Toc240133409 \h </w:instrText>
             </w:r>
             <w:r>
               <w:rPr>
@@ -3981,7 +3982,7 @@
               <w14:ligatures w14:val="standardContextual"/>
             </w:rPr>
           </w:pPr>
-          <w:hyperlink w:anchor="_Toc240131156" w:history="1">
+          <w:hyperlink w:anchor="_Toc240133410" w:history="1">
             <w:r>
               <w:rPr>
                 <w:rStyle w:val="Hyperlink"/>
@@ -4008,7 +4009,7 @@
                 <w:noProof/>
                 <w:webHidden/>
               </w:rPr>
-              <w:instrText xml:space="preserve"> PAGEREF _Toc240131156 \h </w:instrText>
+              <w:instrText xml:space="preserve"> PAGEREF _Toc240133410 \h </w:instrText>
             </w:r>
             <w:r>
               <w:rPr>
@@ -4053,7 +4054,7 @@
               <w14:ligatures w14:val="standardContextual"/>
             </w:rPr>
           </w:pPr>
-          <w:hyperlink w:anchor="_Toc240131157" w:history="1">
+          <w:hyperlink w:anchor="_Toc240133411" w:history="1">
             <w:r>
               <w:rPr>
                 <w:rStyle w:val="Hyperlink"/>
@@ -4080,7 +4081,7 @@
                 <w:noProof/>
                 <w:webHidden/>
               </w:rPr>
-              <w:instrText xml:space="preserve"> PAGEREF _Toc240131157 \h </w:instrText>
+              <w:instrText xml:space="preserve"> PAGEREF _Toc240133411 \h </w:instrText>
             </w:r>
             <w:r>
               <w:rPr>
@@ -4125,7 +4126,7 @@
               <w14:ligatures w14:val="standardContextual"/>
             </w:rPr>
           </w:pPr>
-          <w:hyperlink w:anchor="_Toc240131158" w:history="1">
+          <w:hyperlink w:anchor="_Toc240133412" w:history="1">
             <w:r>
               <w:rPr>
                 <w:rStyle w:val="Hyperlink"/>
@@ -4152,7 +4153,7 @@
                 <w:noProof/>
                 <w:webHidden/>
               </w:rPr>
-              <w:instrText xml:space="preserve"> PAGEREF _Toc240131158 \h </w:instrText>
+              <w:instrText xml:space="preserve"> PAGEREF _Toc240133412 \h </w:instrText>
             </w:r>
             <w:r>
               <w:rPr>
@@ -4197,7 +4198,7 @@
               <w14:ligatures w14:val="standardContextual"/>
             </w:rPr>
           </w:pPr>
-          <w:hyperlink w:anchor="_Toc240131159" w:history="1">
+          <w:hyperlink w:anchor="_Toc240133413" w:history="1">
             <w:r>
               <w:rPr>
                 <w:rStyle w:val="Hyperlink"/>
@@ -4224,7 +4225,7 @@
                 <w:noProof/>
                 <w:webHidden/>
               </w:rPr>
-              <w:instrText xml:space="preserve"> PAGEREF _Toc240131159 \h </w:instrText>
+              <w:instrText xml:space="preserve"> PAGEREF _Toc240133413 \h </w:instrText>
             </w:r>
             <w:r>
               <w:rPr>
@@ -4269,7 +4270,7 @@
               <w14:ligatures w14:val="standardContextual"/>
             </w:rPr>
           </w:pPr>
-          <w:hyperlink w:anchor="_Toc240131160" w:history="1">
+          <w:hyperlink w:anchor="_Toc240133414" w:history="1">
             <w:r>
               <w:rPr>
                 <w:rStyle w:val="Hyperlink"/>
@@ -4296,7 +4297,7 @@
                 <w:noProof/>
                 <w:webHidden/>
               </w:rPr>
-              <w:instrText xml:space="preserve"> PAGEREF _Toc240131160 \h </w:instrText>
+              <w:instrText xml:space="preserve"> PAGEREF _Toc240133414 \h </w:instrText>
             </w:r>
             <w:r>
               <w:rPr>
@@ -4341,7 +4342,7 @@
               <w14:ligatures w14:val="standardContextual"/>
             </w:rPr>
           </w:pPr>
-          <w:hyperlink w:anchor="_Toc240131161" w:history="1">
+          <w:hyperlink w:anchor="_Toc240133415" w:history="1">
             <w:r>
               <w:rPr>
                 <w:rStyle w:val="Hyperlink"/>
@@ -4368,7 +4369,7 @@
                 <w:noProof/>
                 <w:webHidden/>
               </w:rPr>
-              <w:instrText xml:space="preserve"> PAGEREF _Toc240131161 \h </w:instrText>
+              <w:instrText xml:space="preserve"> PAGEREF _Toc240133415 \h </w:instrText>
             </w:r>
             <w:r>
               <w:rPr>
@@ -4413,7 +4414,7 @@
               <w14:ligatures w14:val="standardContextual"/>
             </w:rPr>
           </w:pPr>
-          <w:hyperlink w:anchor="_Toc240131162" w:history="1">
+          <w:hyperlink w:anchor="_Toc240133416" w:history="1">
             <w:r>
               <w:rPr>
                 <w:rStyle w:val="Hyperlink"/>
@@ -4440,7 +4441,7 @@
                 <w:noProof/>
                 <w:webHidden/>
               </w:rPr>
-              <w:instrText xml:space="preserve"> PAGEREF _Toc240131162 \h </w:instrText>
+              <w:instrText xml:space="preserve"> PAGEREF _Toc240133416 \h </w:instrText>
             </w:r>
             <w:r>
               <w:rPr>
@@ -4485,7 +4486,7 @@
               <w14:ligatures w14:val="standardContextual"/>
             </w:rPr>
           </w:pPr>
-          <w:hyperlink w:anchor="_Toc240131163" w:history="1">
+          <w:hyperlink w:anchor="_Toc240133417" w:history="1">
             <w:r>
               <w:rPr>
                 <w:rStyle w:val="Hyperlink"/>
@@ -4512,7 +4513,7 @@
                 <w:noProof/>
                 <w:webHidden/>
               </w:rPr>
-              <w:instrText xml:space="preserve"> PAGEREF _Toc240131163 \h </w:instrText>
+              <w:instrText xml:space="preserve"> PAGEREF _Toc240133417 \h </w:instrText>
             </w:r>
             <w:r>
               <w:rPr>
@@ -4557,7 +4558,7 @@
               <w14:ligatures w14:val="standardContextual"/>
             </w:rPr>
           </w:pPr>
-          <w:hyperlink w:anchor="_Toc240131164" w:history="1">
+          <w:hyperlink w:anchor="_Toc240133418" w:history="1">
             <w:r>
               <w:rPr>
                 <w:rStyle w:val="Hyperlink"/>
@@ -4584,7 +4585,7 @@
                 <w:noProof/>
                 <w:webHidden/>
               </w:rPr>
-              <w:instrText xml:space="preserve"> PAGEREF _Toc240131164 \h </w:instrText>
+              <w:instrText xml:space="preserve"> PAGEREF _Toc240133418 \h </w:instrText>
             </w:r>
             <w:r>
               <w:rPr>
@@ -4629,7 +4630,7 @@
               <w14:ligatures w14:val="standardContextual"/>
             </w:rPr>
           </w:pPr>
-          <w:hyperlink w:anchor="_Toc240131165" w:history="1">
+          <w:hyperlink w:anchor="_Toc240133419" w:history="1">
             <w:r>
               <w:rPr>
                 <w:rStyle w:val="Hyperlink"/>
@@ -4656,7 +4657,7 @@
                 <w:noProof/>
                 <w:webHidden/>
               </w:rPr>
-              <w:instrText xml:space="preserve"> PAGEREF _Toc240131165 \h </w:instrText>
+              <w:instrText xml:space="preserve"> PAGEREF _Toc240133419 \h </w:instrText>
             </w:r>
             <w:r>
               <w:rPr>
@@ -4701,7 +4702,7 @@
               <w14:ligatures w14:val="standardContextual"/>
             </w:rPr>
           </w:pPr>
-          <w:hyperlink w:anchor="_Toc240131166" w:history="1">
+          <w:hyperlink w:anchor="_Toc240133420" w:history="1">
             <w:r>
               <w:rPr>
                 <w:rStyle w:val="Hyperlink"/>
@@ -4728,7 +4729,7 @@
                 <w:noProof/>
                 <w:webHidden/>
               </w:rPr>
-              <w:instrText xml:space="preserve"> PAGEREF _Toc240131166 \h </w:instrText>
+              <w:instrText xml:space="preserve"> PAGEREF _Toc240133420 \h </w:instrText>
             </w:r>
             <w:r>
               <w:rPr>
@@ -4773,7 +4774,7 @@
               <w14:ligatures w14:val="standardContextual"/>
             </w:rPr>
           </w:pPr>
-          <w:hyperlink w:anchor="_Toc240131167" w:history="1">
+          <w:hyperlink w:anchor="_Toc240133421" w:history="1">
             <w:r>
               <w:rPr>
                 <w:rStyle w:val="Hyperlink"/>
@@ -4800,7 +4801,7 @@
                 <w:noProof/>
                 <w:webHidden/>
               </w:rPr>
-              <w:instrText xml:space="preserve"> PAGEREF _Toc240131167 \h </w:instrText>
+              <w:instrText xml:space="preserve"> PAGEREF _Toc240133421 \h </w:instrText>
             </w:r>
             <w:r>
               <w:rPr>
@@ -4845,7 +4846,7 @@
               <w14:ligatures w14:val="standardContextual"/>
             </w:rPr>
           </w:pPr>
-          <w:hyperlink w:anchor="_Toc240131168" w:history="1">
+          <w:hyperlink w:anchor="_Toc240133422" w:history="1">
             <w:r>
               <w:rPr>
                 <w:rStyle w:val="Hyperlink"/>
@@ -4872,7 +4873,7 @@
                 <w:noProof/>
                 <w:webHidden/>
               </w:rPr>
-              <w:instrText xml:space="preserve"> PAGEREF _Toc240131168 \h </w:instrText>
+              <w:instrText xml:space="preserve"> PAGEREF _Toc240133422 \h </w:instrText>
             </w:r>
             <w:r>
               <w:rPr>
@@ -4917,7 +4918,7 @@
               <w14:ligatures w14:val="standardContextual"/>
             </w:rPr>
           </w:pPr>
-          <w:hyperlink w:anchor="_Toc240131169" w:history="1">
+          <w:hyperlink w:anchor="_Toc240133423" w:history="1">
             <w:r>
               <w:rPr>
                 <w:rStyle w:val="Hyperlink"/>
@@ -4944,7 +4945,7 @@
                 <w:noProof/>
                 <w:webHidden/>
               </w:rPr>
-              <w:instrText xml:space="preserve"> PAGEREF _Toc240131169 \h </w:instrText>
+              <w:instrText xml:space="preserve"> PAGEREF _Toc240133423 \h </w:instrText>
             </w:r>
             <w:r>
               <w:rPr>
@@ -4989,7 +4990,7 @@
               <w14:ligatures w14:val="standardContextual"/>
             </w:rPr>
           </w:pPr>
-          <w:hyperlink w:anchor="_Toc240131170" w:history="1">
+          <w:hyperlink w:anchor="_Toc240133424" w:history="1">
             <w:r>
               <w:rPr>
                 <w:rStyle w:val="Hyperlink"/>
@@ -5016,7 +5017,7 @@
                 <w:noProof/>
                 <w:webHidden/>
               </w:rPr>
-              <w:instrText xml:space="preserve"> PAGEREF _Toc240131170 \h </w:instrText>
+              <w:instrText xml:space="preserve"> PAGEREF _Toc240133424 \h </w:instrText>
             </w:r>
             <w:r>
               <w:rPr>
@@ -5061,7 +5062,7 @@
               <w14:ligatures w14:val="standardContextual"/>
             </w:rPr>
           </w:pPr>
-          <w:hyperlink w:anchor="_Toc240131171" w:history="1">
+          <w:hyperlink w:anchor="_Toc240133425" w:history="1">
             <w:r>
               <w:rPr>
                 <w:rStyle w:val="Hyperlink"/>
@@ -5088,7 +5089,7 @@
                 <w:noProof/>
                 <w:webHidden/>
               </w:rPr>
-              <w:instrText xml:space="preserve"> PAGEREF _Toc240131171 \h </w:instrText>
+              <w:instrText xml:space="preserve"> PAGEREF _Toc240133425 \h </w:instrText>
             </w:r>
             <w:r>
               <w:rPr>
@@ -5109,6 +5110,78 @@
                 <w:webHidden/>
               </w:rPr>
               <w:t>iv</w:t>
+            </w:r>
+            <w:r>
+              <w:rPr>
+                <w:noProof/>
+                <w:webHidden/>
+              </w:rPr>
+              <w:fldChar w:fldCharType="end"/>
+            </w:r>
+          </w:hyperlink>
+        </w:p>
+        <w:p>
+          <w:pPr>
+            <w:pStyle w:val="TOC2"/>
+            <w:tabs>
+              <w:tab w:val="right" w:leader="dot" w:pos="9350"/>
+            </w:tabs>
+            <w:rPr>
+              <w:rFonts w:eastAsiaTheme="minorEastAsia"/>
+              <w:noProof/>
+              <w:kern w:val="2"/>
+              <w:lang w:val="en-ZA" w:eastAsia="en-ZA"/>
+              <w14:ligatures w14:val="standardContextual"/>
+            </w:rPr>
+          </w:pPr>
+          <w:hyperlink w:anchor="_Toc240133426" w:history="1">
+            <w:r>
+              <w:rPr>
+                <w:rStyle w:val="Hyperlink"/>
+                <w:noProof/>
+              </w:rPr>
+              <w:t>Appendix G — Individual Reflective Statement</w:t>
+            </w:r>
+            <w:r>
+              <w:rPr>
+                <w:noProof/>
+                <w:webHidden/>
+              </w:rPr>
+              <w:tab/>
+            </w:r>
+            <w:r>
+              <w:rPr>
+                <w:noProof/>
+                <w:webHidden/>
+              </w:rPr>
+              <w:fldChar w:fldCharType="begin"/>
+            </w:r>
+            <w:r>
+              <w:rPr>
+                <w:noProof/>
+                <w:webHidden/>
+              </w:rPr>
+              <w:instrText xml:space="preserve"> PAGEREF _Toc240133426 \h </w:instrText>
+            </w:r>
+            <w:r>
+              <w:rPr>
+                <w:noProof/>
+                <w:webHidden/>
+              </w:rPr>
+            </w:r>
+            <w:r>
+              <w:rPr>
+                <w:noProof/>
+                <w:webHidden/>
+              </w:rPr>
+              <w:fldChar w:fldCharType="separate"/>
+            </w:r>
+            <w:r>
+              <w:rPr>
+                <w:noProof/>
+                <w:webHidden/>
+              </w:rPr>
+              <w:t>v</w:t>
             </w:r>
             <w:r>
               <w:rPr>
@@ -5142,7 +5215,7 @@
       <w:pPr>
         <w:pStyle w:val="Heading1"/>
       </w:pPr>
-      <w:bookmarkStart w:id="1" w:name="_Toc240131103"/>
+      <w:bookmarkStart w:id="1" w:name="_Toc240133357"/>
       <w:r>
         <w:lastRenderedPageBreak/>
         <w:t>Executive Summary</w:t>
@@ -5180,7 +5253,15 @@
         <w:t>16.1% turnover rate</w:t>
       </w:r>
       <w:r>
-        <w:t>. With a replacement cost of 1.5 times the annual salary, and assuming all departures happened within a year, Helix is incurring about $20.4 million annually to replace staff, without any strategy to forecast, target, or prevent these exits.</w:t>
+        <w:t xml:space="preserve">. With a replacement cost of 1.5 times the annual salary, and assuming all departures </w:t>
+      </w:r>
+      <w:proofErr w:type="gramStart"/>
+      <w:r>
+        <w:t>happened</w:t>
+      </w:r>
+      <w:proofErr w:type="gramEnd"/>
+      <w:r>
+        <w:t xml:space="preserve"> within a year, Helix is incurring about $20.4 million annually to replace staff, without any strategy to forecast, target, or prevent these exits.</w:t>
       </w:r>
     </w:p>
     <w:p>
@@ -5194,7 +5275,15 @@
         <w:t>is not</w:t>
       </w:r>
       <w:r>
-        <w:t xml:space="preserve"> the compensation policy itself, but rather the timing. Helix’s HR team tends to react: they identify attrition only when employees resign, at which point costs are already incurred, and the only actions are to requisition and backfill positions. Helix commits all associated expenses after </w:t>
+        <w:t xml:space="preserve"> the compensation policy itself, but rather the timing. Helix’s HR team tends to </w:t>
+      </w:r>
+      <w:proofErr w:type="gramStart"/>
+      <w:r>
+        <w:t>react:</w:t>
+      </w:r>
+      <w:proofErr w:type="gramEnd"/>
+      <w:r>
+        <w:t xml:space="preserve"> they identify attrition only when employees resign, at which point costs are already incurred, and the only actions are to requisition and backfill positions. Helix commits all associated expenses after </w:t>
       </w:r>
       <w:r>
         <w:t>employees decide to leave</w:t>
@@ -5262,7 +5351,15 @@
         <w:t>The financial assessment relies on an unverified time reference.</w:t>
       </w:r>
       <w:r>
-        <w:t xml:space="preserve"> The dataset notes that 237 employees left but does not specify the period during which these departures happened. If these departures occurred over three years instead of one, the actual yearly cost is around $6.8 million, meaning the program </w:t>
+        <w:t xml:space="preserve"> The dataset notes that 237 employees left but does not specify the period during which these departures happened. If these departures </w:t>
+      </w:r>
+      <w:proofErr w:type="gramStart"/>
+      <w:r>
+        <w:t>occurred</w:t>
+      </w:r>
+      <w:proofErr w:type="gramEnd"/>
+      <w:r>
+        <w:t xml:space="preserve"> over three years instead of one, the actual yearly cost is around $6.8 million, meaning the program </w:t>
       </w:r>
       <w:r>
         <w:t>is not</w:t>
@@ -5334,7 +5431,15 @@
         <w:pStyle w:val="BodyText"/>
       </w:pPr>
       <w:r>
-        <w:t xml:space="preserve">What remains to be confirmed is that the classifier functions as a sensor, generating lead time without retaining anyone on its own. The success of the return relies on an HR intervention's effectiveness, which Helix has not previously measured. Consequently, </w:t>
+        <w:t xml:space="preserve">What remains to be confirmed is that the classifier functions as a sensor, generating lead time without retaining anyone on its own. The success of the return relies on </w:t>
+      </w:r>
+      <w:proofErr w:type="gramStart"/>
+      <w:r>
+        <w:t>an</w:t>
+      </w:r>
+      <w:proofErr w:type="gramEnd"/>
+      <w:r>
+        <w:t xml:space="preserve"> HR intervention's effectiveness, which Helix has not previously measured. Consequently, </w:t>
       </w:r>
       <w:r>
         <w:t>we recommend investing</w:t>
@@ -5357,7 +5462,7 @@
       <w:pPr>
         <w:pStyle w:val="Heading1"/>
       </w:pPr>
-      <w:bookmarkStart w:id="3" w:name="_Toc240131104"/>
+      <w:bookmarkStart w:id="3" w:name="_Toc240133358"/>
       <w:r>
         <w:lastRenderedPageBreak/>
         <w:t>Company Overview</w:t>
@@ -5386,12 +5491,14 @@
       <w:r>
         <w:t xml:space="preserve">Helix operates a hybrid capital-plus-recurring model. Instrument sales generate the initial contract value; the recurring layer — reagent and consumable supply, service contracts, and per-seat subscription to the Helix Cloud analytics platform — now accounts for just over half of gross margin and is the strategic engine of the business. This model is deliberately engineering-intensive: the company’s ability to keep instruments in the </w:t>
       </w:r>
+      <w:proofErr w:type="gramStart"/>
       <w:r>
         <w:t>field</w:t>
       </w:r>
       <w:r>
         <w:t>,</w:t>
       </w:r>
+      <w:proofErr w:type="gramEnd"/>
       <w:r>
         <w:t xml:space="preserve"> certified and supported over a ten- to fifteen-year service life, is what converts a one-time sale into a decade of annuity revenue.</w:t>
       </w:r>
@@ -5455,7 +5562,15 @@
         <w:pStyle w:val="BodyText"/>
       </w:pPr>
       <w:r>
-        <w:t>All three benefits rely on a single dependence. They exist in the minds of certain engineers, scientists, and field representatives, and they diminish when those individuals depart. Helix’s competitive edge is directly linked to its ability to retain these people.</w:t>
+        <w:t xml:space="preserve">All three benefits rely on </w:t>
+      </w:r>
+      <w:proofErr w:type="gramStart"/>
+      <w:r>
+        <w:t>a single</w:t>
+      </w:r>
+      <w:proofErr w:type="gramEnd"/>
+      <w:r>
+        <w:t xml:space="preserve"> dependence. They exist in the minds of certain engineers, scientists, and field representatives, and they diminish when those individuals depart. Helix’s competitive edge is directly linked to its ability to retain these people.</w:t>
       </w:r>
     </w:p>
     <w:p>
@@ -5463,7 +5578,7 @@
         <w:pStyle w:val="Heading1"/>
       </w:pPr>
       <w:bookmarkStart w:id="4" w:name="team-and-project"/>
-      <w:bookmarkStart w:id="5" w:name="_Toc240131105"/>
+      <w:bookmarkStart w:id="5" w:name="_Toc240133359"/>
       <w:bookmarkEnd w:id="2"/>
       <w:r>
         <w:t>Team and Project</w:t>
@@ -5475,7 +5590,7 @@
         <w:pStyle w:val="Heading2"/>
       </w:pPr>
       <w:bookmarkStart w:id="6" w:name="project-description"/>
-      <w:bookmarkStart w:id="7" w:name="_Toc240131106"/>
+      <w:bookmarkStart w:id="7" w:name="_Toc240133360"/>
       <w:r>
         <w:t>Project Description</w:t>
       </w:r>
@@ -5496,7 +5611,15 @@
         <w:t xml:space="preserve">variable indicates whether an employee left, </w:t>
       </w:r>
       <w:r>
-        <w:t>not when, the model functions as a propensity ranker rather than a time-to-event predictor. This key constraint underpins every claim in this report.</w:t>
+        <w:t xml:space="preserve">not </w:t>
+      </w:r>
+      <w:proofErr w:type="gramStart"/>
+      <w:r>
+        <w:t>when,</w:t>
+      </w:r>
+      <w:proofErr w:type="gramEnd"/>
+      <w:r>
+        <w:t xml:space="preserve"> the model functions as a propensity ranker rather than a time-to-event predictor. This key constraint underpins every claim in this report.</w:t>
       </w:r>
     </w:p>
     <w:p>
@@ -5504,10 +5627,23 @@
         <w:pStyle w:val="BodyText"/>
       </w:pPr>
       <w:r>
-        <w:t xml:space="preserve">The analytical challenge arises at the crossroads of three key areas. First, human capital management offers the domain-specific vocabulary—terms like attrition, regrettable versus non-regrettable turnover, flight risk, time-to-fill, and ramp-to-productivity—as well as the crucial legal and ethical boundaries for using a risk score once developed. Second, applied statistical learning supplies the methodology: feature engineering across various HR variables, managing a highly imbalanced target class, choosing between interpretable models and ensemble classifiers, and fine-tuning thresholds with an asymmetric cost function. Lastly, managerial finance guides the decision-making process: </w:t>
-      </w:r>
-      <w:r>
-        <w:t xml:space="preserve">deploy a model only </w:t>
+        <w:t xml:space="preserve">The analytical challenge arises at the crossroads of three key areas. First, human capital management offers </w:t>
+      </w:r>
+      <w:proofErr w:type="gramStart"/>
+      <w:r>
+        <w:t>the domain</w:t>
+      </w:r>
+      <w:proofErr w:type="gramEnd"/>
+      <w:r>
+        <w:t xml:space="preserve">-specific vocabulary—terms like attrition, regrettable versus non-regrettable turnover, flight risk, time-to-fill, and ramp-to-productivity—as well as the crucial legal and ethical boundaries for using a risk score once developed. Second, applied statistical learning supplies the methodology: feature engineering across various HR variables, managing a highly imbalanced target class, choosing between interpretable models and ensemble classifiers, and fine-tuning thresholds with an asymmetric cost function. Lastly, managerial finance guides the decision-making process: </w:t>
+      </w:r>
+      <w:proofErr w:type="gramStart"/>
+      <w:r>
+        <w:t>deploy</w:t>
+      </w:r>
+      <w:proofErr w:type="gramEnd"/>
+      <w:r>
+        <w:t xml:space="preserve"> a model only </w:t>
       </w:r>
       <w:r>
         <w:t>if the expected benefits of its interventions outweigh the costs of unnecessary actions.</w:t>
@@ -5546,7 +5682,7 @@
         <w:pStyle w:val="Heading2"/>
       </w:pPr>
       <w:bookmarkStart w:id="8" w:name="team-name-and-organization"/>
-      <w:bookmarkStart w:id="9" w:name="_Toc240131107"/>
+      <w:bookmarkStart w:id="9" w:name="_Toc240133361"/>
       <w:bookmarkEnd w:id="6"/>
       <w:r>
         <w:t>Team Name and Organization</w:t>
@@ -5591,7 +5727,15 @@
         <w:pStyle w:val="BodyText"/>
       </w:pPr>
       <w:r>
-        <w:t>Philip is applying for the Master of Science in Business Analytics at Quantic School of Business and Technology. He earned a Bachelor of Engineering in Chemical Engineering from the University of Pretoria and is presently a Process and Data Analytics Engineer, specializing in deriving decision-making insights from large-scale industrial process and asset data.</w:t>
+        <w:t xml:space="preserve">Philip is applying for the Master of Science in Business Analytics at Quantic School of Business and Technology. He earned a Bachelor of Engineering in Chemical Engineering from the University of Pretoria and is presently a Process and Data Analytics Engineer, specializing in deriving decision-making insights from large-scale industrial </w:t>
+      </w:r>
+      <w:proofErr w:type="gramStart"/>
+      <w:r>
+        <w:t>process</w:t>
+      </w:r>
+      <w:proofErr w:type="gramEnd"/>
+      <w:r>
+        <w:t xml:space="preserve"> and asset data.</w:t>
       </w:r>
     </w:p>
     <w:p>
@@ -5599,7 +5743,15 @@
         <w:pStyle w:val="BodyText"/>
       </w:pPr>
       <w:r>
-        <w:t xml:space="preserve">His technical stack includes Python (pandas, scikit-learn, seaborn, matplotlib) for modeling and analysis, R for statistical testing and diagnostics, PostgreSQL for data extraction and relational modeling, and Tableau for stakeholder visualization. His professional background aligns with this project in a key way: process engineering involves predicting system failures using instrumented condition data and justifying preventive measures to avoid costly failures. The Employee Retention Predictor applies the same logic to human </w:t>
+        <w:t xml:space="preserve">His technical stack includes Python (pandas, scikit-learn, seaborn, matplotlib) for modeling and analysis, R for statistical testing and diagnostics, PostgreSQL for data extraction and relational modeling, and Tableau for stakeholder visualization. His professional background aligns with this project in a </w:t>
+      </w:r>
+      <w:proofErr w:type="gramStart"/>
+      <w:r>
+        <w:t>key way</w:t>
+      </w:r>
+      <w:proofErr w:type="gramEnd"/>
+      <w:r>
+        <w:t xml:space="preserve">: process engineering involves predicting system failures using instrumented condition data and justifying preventive measures to avoid costly failures. The Employee Retention Predictor applies the same logic to human </w:t>
       </w:r>
       <w:r>
         <w:lastRenderedPageBreak/>
@@ -5619,7 +5771,7 @@
         <w:pStyle w:val="Heading2"/>
       </w:pPr>
       <w:bookmarkStart w:id="10" w:name="skills-concerns"/>
-      <w:bookmarkStart w:id="11" w:name="_Toc240131108"/>
+      <w:bookmarkStart w:id="11" w:name="_Toc240133362"/>
       <w:bookmarkEnd w:id="8"/>
       <w:r>
         <w:t>Skills Concerns</w:t>
@@ -5652,7 +5804,15 @@
         <w:t>each phase is shorter</w:t>
       </w:r>
       <w:r>
-        <w:t>. The main mitigation strategy is strict scope control. The project is intentionally limited to one dataset and one target variable, serving as a proof of concept rather than a full production deployment. Additional potential extensions—such as natural-language analysis of exit interview text, network analysis of manager-team contagion, or survival modeling of departure timing—are explicitly out of scope, with reasons documented in the Scope section. Maintaining scope discipline, rather than relying on extraordinary effort, is the key safeguard.</w:t>
+        <w:t xml:space="preserve">. The main mitigation strategy is strict scope control. The project is intentionally limited to one dataset and one target variable, serving as </w:t>
+      </w:r>
+      <w:proofErr w:type="gramStart"/>
+      <w:r>
+        <w:t>a proof</w:t>
+      </w:r>
+      <w:proofErr w:type="gramEnd"/>
+      <w:r>
+        <w:t xml:space="preserve"> of concept rather than a full production deployment. Additional potential extensions—such as natural-language analysis of exit interview text, network analysis of manager-team contagion, or survival modeling of departure timing—are explicitly out of scope, with reasons documented in the Scope section. Maintaining scope discipline, rather than relying on extraordinary effort, is the key safeguard.</w:t>
       </w:r>
     </w:p>
     <w:p>
@@ -5667,7 +5827,15 @@
         <w:t xml:space="preserve">Technical depth risk. </w:t>
       </w:r>
       <w:r>
-        <w:t xml:space="preserve">Individual practitioners may not be equally proficient in statistical modeling, software engineering, and financial analysis. While relying on scikit-learn provides some control, it is not enough and is not the main mitigation strategy. A thoroughly tested library will faithfully implement a poor specification just as well as a good one, offering no safeguard against critical errors such as selecting the wrong target, </w:t>
+        <w:t>Individual practitioners may not be equally proficient in statistical modeling, software engineering, and financial analysis. While relying on scikit-</w:t>
+      </w:r>
+      <w:proofErr w:type="gramStart"/>
+      <w:r>
+        <w:t>learn</w:t>
+      </w:r>
+      <w:proofErr w:type="gramEnd"/>
+      <w:r>
+        <w:t xml:space="preserve"> provides some control, it is not enough and is not the main mitigation strategy. A thoroughly tested library will faithfully implement a poor specification just as well as a good one, offering no safeguard against critical errors such as selecting the wrong target, </w:t>
       </w:r>
       <w:proofErr w:type="spellStart"/>
       <w:r>
@@ -5692,9 +5860,11 @@
       <w:r>
         <w:t xml:space="preserve"> involves establishing success criteria, thresholds, and the evaluation metric in advance and documenting them transparently, </w:t>
       </w:r>
+      <w:proofErr w:type="gramStart"/>
       <w:r>
         <w:t>whether or not</w:t>
       </w:r>
+      <w:proofErr w:type="gramEnd"/>
       <w:r>
         <w:t xml:space="preserve"> they are achieved. This approach limits </w:t>
       </w:r>
@@ -5720,7 +5890,15 @@
         <w:t xml:space="preserve"> involves evaluating a written checklist, where each analytical choice is tested against a consistent set of questions: </w:t>
       </w:r>
       <w:r>
-        <w:t>Is this based on measurement or assumption? What could disprove it? What is the most costly error? Is</w:t>
+        <w:t xml:space="preserve">Is this based on measurement or assumption? What could disprove it? What is the </w:t>
+      </w:r>
+      <w:proofErr w:type="gramStart"/>
+      <w:r>
+        <w:t>most costly</w:t>
+      </w:r>
+      <w:proofErr w:type="gramEnd"/>
+      <w:r>
+        <w:t xml:space="preserve"> error? Is</w:t>
       </w:r>
       <w:r>
         <w:t xml:space="preserve"> there a citable source? The two most significant corrections in this engagement—a mis-specified recall criterion and an intervention cost model unrelated to the EDA results—originated from this process, not the library.</w:t>
@@ -5823,7 +6001,7 @@
       <w:pPr>
         <w:pStyle w:val="Heading1"/>
       </w:pPr>
-      <w:bookmarkStart w:id="13" w:name="_Toc240131109"/>
+      <w:bookmarkStart w:id="13" w:name="_Toc240133363"/>
       <w:r>
         <w:lastRenderedPageBreak/>
         <w:t>Strategic Analysis</w:t>
@@ -5835,7 +6013,7 @@
         <w:pStyle w:val="Heading2"/>
       </w:pPr>
       <w:bookmarkStart w:id="14" w:name="external-analysis"/>
-      <w:bookmarkStart w:id="15" w:name="_Toc240131110"/>
+      <w:bookmarkStart w:id="15" w:name="_Toc240133364"/>
       <w:r>
         <w:t>External Analysis</w:t>
       </w:r>
@@ -5933,7 +6111,15 @@
         <w:t>A few large, diversified manufacturers with higher pay scales and strong employer brands mainly control the instrument market Helix operates in. At the same time,</w:t>
       </w:r>
       <w:r>
-        <w:t xml:space="preserve"> numerous venture-funded startups compete mainly through potential equity gains. Helix faces pressure from both sides and cannot succeed solely on compensation differences.</w:t>
+        <w:t xml:space="preserve"> numerous venture-funded startups compete mainly through potential equity gains. Helix faces pressure from both sides and cannot succeed solely </w:t>
+      </w:r>
+      <w:proofErr w:type="gramStart"/>
+      <w:r>
+        <w:t>on</w:t>
+      </w:r>
+      <w:proofErr w:type="gramEnd"/>
+      <w:r>
+        <w:t xml:space="preserve"> compensation differences.</w:t>
       </w:r>
     </w:p>
     <w:p>
@@ -5983,7 +6169,7 @@
         <w:pStyle w:val="Heading2"/>
       </w:pPr>
       <w:bookmarkStart w:id="16" w:name="internal-analysis"/>
-      <w:bookmarkStart w:id="17" w:name="_Toc240131111"/>
+      <w:bookmarkStart w:id="17" w:name="_Toc240133365"/>
       <w:bookmarkEnd w:id="14"/>
       <w:r>
         <w:t>Internal Analysis</w:t>
@@ -6071,7 +6257,15 @@
       </w:r>
       <w:r>
         <w:lastRenderedPageBreak/>
-        <w:t>averages, which conceal individual risks. Third, interventions lack focus; without targeted approaches, retention efforts must either be broadly applied—costly—or based on managerial intuition, which is difficult to audit and introduces inconsistency risks.</w:t>
+        <w:t xml:space="preserve">averages, which conceal individual risks. Third, interventions lack focus; without targeted approaches, retention efforts </w:t>
+      </w:r>
+      <w:proofErr w:type="gramStart"/>
+      <w:r>
+        <w:t>must either</w:t>
+      </w:r>
+      <w:proofErr w:type="gramEnd"/>
+      <w:r>
+        <w:t xml:space="preserve"> be broadly applied—costly—or based on managerial intuition, which is difficult to audit and introduces inconsistency risks.</w:t>
       </w:r>
     </w:p>
     <w:p>
@@ -6079,7 +6273,15 @@
         <w:pStyle w:val="BodyText"/>
       </w:pPr>
       <w:r>
-        <w:t>The financial gap is quantifiable based on the client’s records. Departing employees have an average monthly income of $4,787, compared to $6,833 for those who remain, indicating that attrition mostly affects early-career and lower-band roles, though not only those. When annualized, the average departing salary is $57,445. Using a 1.5× replacement cost, each departure costs about $86,000. With 237 departures annually, the total annual replacement expense is roughly $20.4 million, representing about 6% of revenue under a one-year projection.</w:t>
+        <w:t xml:space="preserve">The financial gap is quantifiable based on the client’s records. Departing employees have an average monthly income of $4,787, compared to $6,833 for those who remain, indicating that attrition mostly affects early-career and lower-band roles, though not only those. When annualized, the average departing salary is $57,445. Using a 1.5× replacement cost, each departure costs </w:t>
+      </w:r>
+      <w:proofErr w:type="gramStart"/>
+      <w:r>
+        <w:t>about</w:t>
+      </w:r>
+      <w:proofErr w:type="gramEnd"/>
+      <w:r>
+        <w:t xml:space="preserve"> $86,000. With 237 departures annually, the total annual replacement expense is roughly $20.4 million, representing about 6% of revenue under a one-year projection.</w:t>
       </w:r>
     </w:p>
     <w:p>
@@ -6112,7 +6314,7 @@
       <w:pPr>
         <w:pStyle w:val="Heading1"/>
       </w:pPr>
-      <w:bookmarkStart w:id="19" w:name="_Toc240131112"/>
+      <w:bookmarkStart w:id="19" w:name="_Toc240133366"/>
       <w:r>
         <w:lastRenderedPageBreak/>
         <w:t>Analytics Opportunity</w:t>
@@ -6181,7 +6383,15 @@
         <w:t>acting on it</w:t>
       </w:r>
       <w:r>
-        <w:t xml:space="preserve">. Helix has data that can predict attrition—such as overtime patterns, promotion stagnation, satisfaction scores, commute distance, compensation position, and tenure with the current manager. However, this information is stored in a system made for record-keeping, not for making inferences. </w:t>
+        <w:t xml:space="preserve">. Helix has data that can predict </w:t>
+      </w:r>
+      <w:proofErr w:type="gramStart"/>
+      <w:r>
+        <w:t>attrition—</w:t>
+      </w:r>
+      <w:proofErr w:type="gramEnd"/>
+      <w:r>
+        <w:t xml:space="preserve">such as overtime patterns, promotion stagnation, satisfaction scores, commute distance, compensation position, and tenure with the current manager. However, this information is stored in a system made for record-keeping, not for making inferences. </w:t>
       </w:r>
       <w:r>
         <w:t xml:space="preserve">The data exists, but </w:t>
@@ -6258,7 +6468,7 @@
       <w:pPr>
         <w:pStyle w:val="Heading1"/>
       </w:pPr>
-      <w:bookmarkStart w:id="21" w:name="_Toc240131113"/>
+      <w:bookmarkStart w:id="21" w:name="_Toc240133367"/>
       <w:r>
         <w:lastRenderedPageBreak/>
         <w:t>Rationale</w:t>
@@ -6302,13 +6512,29 @@
         <w:pStyle w:val="BodyText"/>
       </w:pPr>
       <w:r>
-        <w:t xml:space="preserve">The proposed solution involves the Employee Retention Predictor, a supervised classification model trained on historical data linking employee attributes to attrition outcomes. It </w:t>
+        <w:t xml:space="preserve">The proposed solution involves the Employee Retention </w:t>
+      </w:r>
+      <w:proofErr w:type="gramStart"/>
+      <w:r>
+        <w:t>Predictor,</w:t>
+      </w:r>
+      <w:proofErr w:type="gramEnd"/>
+      <w:r>
+        <w:t xml:space="preserve"> a supervised classification model trained on historical data linking employee attributes to attrition outcomes. It </w:t>
       </w:r>
       <w:r>
         <w:t>forecasts</w:t>
       </w:r>
       <w:r>
-        <w:t xml:space="preserve"> the current workforce's risk profile. The model produces a ranked risk register: a list of employees sorted by their predicted likelihood of leaving, including the main factors driving each individual's risk.</w:t>
+        <w:t xml:space="preserve"> the current workforce's risk profile. The model produces a ranked risk register: a list of employees sorted by their predicted likelihood of leaving, including the main factors driving </w:t>
+      </w:r>
+      <w:proofErr w:type="gramStart"/>
+      <w:r>
+        <w:t>each individual's</w:t>
+      </w:r>
+      <w:proofErr w:type="gramEnd"/>
+      <w:r>
+        <w:t xml:space="preserve"> risk.</w:t>
       </w:r>
     </w:p>
     <w:p>
@@ -6378,7 +6604,15 @@
         </w:numPr>
       </w:pPr>
       <w:r>
-        <w:t>A false positive, which occurs when predicting an employee will leave but they stay, costs around $5,700. This amount reflects a retention effort costing 10% of the employee's annual salary, even though it was unnecessary.</w:t>
+        <w:t xml:space="preserve">A false positive, which occurs when predicting an employee will leave but they stay, costs around $5,700. This amount reflects a retention effort costing 10% of the </w:t>
+      </w:r>
+      <w:proofErr w:type="gramStart"/>
+      <w:r>
+        <w:t>employee's</w:t>
+      </w:r>
+      <w:proofErr w:type="gramEnd"/>
+      <w:r>
+        <w:t xml:space="preserve"> annual salary, even though it was unnecessary.</w:t>
       </w:r>
     </w:p>
     <w:p>
@@ -6386,7 +6620,15 @@
         <w:pStyle w:val="FirstParagraph"/>
       </w:pPr>
       <w:r>
-        <w:t>The ratio is 15:1, making it the key figure in the engagement since it indicates that the model should prioritize Recall over accuracy or precision. This implies that the proof of concept crosses its economic threshold even at precision rates that would usually be deemed low in typical classification scenarios. Even a model that incorrectly flags most employees can still deliver positive net value as long as it correctly identifies enough actual leavers, because each true positive is worth fifteen times the cost of a false alarm.</w:t>
+        <w:t xml:space="preserve">The ratio is 15:1, making it the key figure in the engagement since it indicates that the model should prioritize Recall over accuracy or precision. This implies that the proof of concept crosses its economic threshold even at precision rates that would usually be deemed low in typical classification scenarios. Even a model that incorrectly flags most employees can still deliver positive net value </w:t>
+      </w:r>
+      <w:proofErr w:type="gramStart"/>
+      <w:r>
+        <w:t>as long as</w:t>
+      </w:r>
+      <w:proofErr w:type="gramEnd"/>
+      <w:r>
+        <w:t xml:space="preserve"> it correctly identifies enough actual leavers, because each true positive is worth fifteen times the cost of a false alarm.</w:t>
       </w:r>
     </w:p>
     <w:p>
@@ -6442,7 +6684,7 @@
       <w:pPr>
         <w:pStyle w:val="Heading1"/>
       </w:pPr>
-      <w:bookmarkStart w:id="23" w:name="_Toc240131114"/>
+      <w:bookmarkStart w:id="23" w:name="_Toc240133368"/>
       <w:r>
         <w:lastRenderedPageBreak/>
         <w:t>Stakeholder and Requirement Analysis</w:t>
@@ -6454,7 +6696,7 @@
         <w:pStyle w:val="Heading2"/>
       </w:pPr>
       <w:bookmarkStart w:id="24" w:name="key-stakeholders"/>
-      <w:bookmarkStart w:id="25" w:name="_Toc240131115"/>
+      <w:bookmarkStart w:id="25" w:name="_Toc240133369"/>
       <w:r>
         <w:t>Key Stakeholders</w:t>
       </w:r>
@@ -6521,7 +6763,15 @@
         <w:t xml:space="preserve"> and focuses only on three metrics: total cost to develop and operate it, net financial benefit, and </w:t>
       </w:r>
       <w:r>
-        <w:t>payback period. His cautious stance is justified — he has previously seen retention spending and considers linking avoided attrition to interventions methodologically uncertain. He will insist that the ROI model’s assumptions be explicitly stated and rigorously stress-tested. He will not accept a benefit estimate that assumes every flagged employee who remains was saved solely by the intervention.</w:t>
+        <w:t xml:space="preserve">payback period. His cautious stance is justified — he has previously seen retention spending and considers linking avoided attrition to interventions methodologically uncertain. He will insist that the ROI model’s assumptions be explicitly stated and rigorously </w:t>
+      </w:r>
+      <w:proofErr w:type="gramStart"/>
+      <w:r>
+        <w:t>stress-tested</w:t>
+      </w:r>
+      <w:proofErr w:type="gramEnd"/>
+      <w:r>
+        <w:t>. He will not accept a benefit estimate that assumes every flagged employee who remains was saved solely by the intervention.</w:t>
       </w:r>
     </w:p>
     <w:p>
@@ -6607,7 +6857,7 @@
         <w:pStyle w:val="Heading2"/>
       </w:pPr>
       <w:bookmarkStart w:id="26" w:name="process-flow"/>
-      <w:bookmarkStart w:id="27" w:name="_Toc240131116"/>
+      <w:bookmarkStart w:id="27" w:name="_Toc240133370"/>
       <w:bookmarkEnd w:id="24"/>
       <w:r>
         <w:t>Process Flow</w:t>
@@ -6649,7 +6899,15 @@
         <w:pStyle w:val="BodyText"/>
       </w:pPr>
       <w:r>
-        <w:t xml:space="preserve">Proposed future state (proactive): HRIS performs scheduled data extraction. It models all active employees, generating a risk register with per-employee feature attribution and ranking. HR business partners review the top-risk group, filtering for context beyond the model's view. They then conduct structured retention discussions with employees and managers. Human judgment determines the intervention from a predefined menu, such as adjusting compensation, promoting or changing roles, rebalancing workloads, offering flexibility or mitigating commutes, or planning development pathways. The </w:t>
+        <w:t xml:space="preserve">Proposed future state (proactive): HRIS performs scheduled data extraction. It models all active employees, generating a risk register with per-employee </w:t>
+      </w:r>
+      <w:proofErr w:type="gramStart"/>
+      <w:r>
+        <w:t>feature</w:t>
+      </w:r>
+      <w:proofErr w:type="gramEnd"/>
+      <w:r>
+        <w:t xml:space="preserve"> attribution and ranking. HR business partners review the top-risk group, filtering for context beyond the model's view. They then conduct structured retention discussions with employees and managers. Human judgment determines the intervention from a predefined menu, such as adjusting compensation, promoting or changing roles, rebalancing workloads, offering flexibility or mitigating commutes, or planning development pathways. The </w:t>
       </w:r>
       <w:r>
         <w:t>system logs the results</w:t>
@@ -6677,7 +6935,7 @@
         <w:pStyle w:val="Heading2"/>
       </w:pPr>
       <w:bookmarkStart w:id="28" w:name="requirements"/>
-      <w:bookmarkStart w:id="29" w:name="_Toc240131117"/>
+      <w:bookmarkStart w:id="29" w:name="_Toc240133371"/>
       <w:bookmarkEnd w:id="26"/>
       <w:r>
         <w:t>Requirements</w:t>
@@ -6726,7 +6984,15 @@
         </w:numPr>
       </w:pPr>
       <w:r>
-        <w:t>What is the marginal impact of prolonged overtime on the likelihood of departure, while keeping job level, income, and tenure unchanged? (VP Engineering.) The expectation is to determine whether the observed raw difference of 30.5% versus 10.4% remains significant after applying controls, especially since the solution—such as headcount adjustments or workload redistribution in particular teams—incurs direct costs and needs justification.</w:t>
+        <w:t xml:space="preserve">What is the marginal impact of prolonged overtime on the likelihood of departure, while keeping job level, income, and tenure unchanged? (VP Engineering.) The expectation is to determine whether the observed raw difference of 30.5% versus 10.4% remains significant after applying controls, especially since </w:t>
+      </w:r>
+      <w:proofErr w:type="gramStart"/>
+      <w:r>
+        <w:t>the solution—</w:t>
+      </w:r>
+      <w:proofErr w:type="gramEnd"/>
+      <w:r>
+        <w:t>such as headcount adjustments or workload redistribution in particular teams—incurs direct costs and needs justification.</w:t>
       </w:r>
     </w:p>
     <w:p>
@@ -6747,7 +7013,15 @@
       </w:r>
       <w:r>
         <w:lastRenderedPageBreak/>
-        <w:t>requirement is officially withdrawn, with full reasoning provided to the CHRO; see Fairness and Proxy Audit.</w:t>
+        <w:t xml:space="preserve">requirement is officially withdrawn, with full reasoning provided </w:t>
+      </w:r>
+      <w:proofErr w:type="gramStart"/>
+      <w:r>
+        <w:t>to</w:t>
+      </w:r>
+      <w:proofErr w:type="gramEnd"/>
+      <w:r>
+        <w:t xml:space="preserve"> the CHRO; see Fairness and Proxy Audit.</w:t>
       </w:r>
     </w:p>
     <w:p>
@@ -6802,7 +7076,15 @@
         </w:numPr>
       </w:pPr>
       <w:r>
-        <w:t xml:space="preserve">What is the model’s false positive rate at the operational threshold? What are the costs of intervening with employees who would not have left? Can the model’s decisions be explained to individual employees? (Finance Director, CHRO, Employee Representatives.) Expected outputs include: </w:t>
+        <w:t xml:space="preserve">What is the model’s false positive rate at the operational threshold? What are the costs of intervening with employees who would not have left? Can the model’s decisions be explained to individual employees? (Finance Director, CHRO, Employee Representatives.) Expected outputs </w:t>
+      </w:r>
+      <w:proofErr w:type="gramStart"/>
+      <w:r>
+        <w:t>include:</w:t>
+      </w:r>
+      <w:proofErr w:type="gramEnd"/>
+      <w:r>
+        <w:t xml:space="preserve"> </w:t>
       </w:r>
       <w:r>
         <w:t>specified precision at deployment, the cost of unnecessary interventions per employee, detailed feature attributions to</w:t>
@@ -6833,7 +7115,7 @@
       <w:pPr>
         <w:pStyle w:val="Heading1"/>
       </w:pPr>
-      <w:bookmarkStart w:id="31" w:name="_Toc240131118"/>
+      <w:bookmarkStart w:id="31" w:name="_Toc240133372"/>
       <w:r>
         <w:lastRenderedPageBreak/>
         <w:t>Success Criteria</w:t>
@@ -6865,7 +7147,7 @@
         <w:pStyle w:val="Heading2"/>
       </w:pPr>
       <w:bookmarkStart w:id="32" w:name="technical-success-criteria"/>
-      <w:bookmarkStart w:id="33" w:name="_Toc240131119"/>
+      <w:bookmarkStart w:id="33" w:name="_Toc240133373"/>
       <w:r>
         <w:t>Technical success criteria</w:t>
       </w:r>
@@ -7049,7 +7331,15 @@
               <w:jc w:val="left"/>
             </w:pPr>
             <w:r>
-              <w:t xml:space="preserve">Each missed leaver costs ≈ $86,000. Capturing three of every four genuine leavers is judged the minimum that materially changes the loss profile. </w:t>
+              <w:t xml:space="preserve">Each missed leaver costs ≈ $86,000. Capturing three of every four genuine leavers is </w:t>
+            </w:r>
+            <w:proofErr w:type="gramStart"/>
+            <w:r>
+              <w:t>judged</w:t>
+            </w:r>
+            <w:proofErr w:type="gramEnd"/>
+            <w:r>
+              <w:t xml:space="preserve"> the minimum that materially changes the loss profile. </w:t>
             </w:r>
             <w:r>
               <w:rPr>
@@ -7569,7 +7859,7 @@
         <w:pStyle w:val="Heading2"/>
       </w:pPr>
       <w:bookmarkStart w:id="34" w:name="business-success-criteria"/>
-      <w:bookmarkStart w:id="35" w:name="_Toc240131120"/>
+      <w:bookmarkStart w:id="35" w:name="_Toc240133374"/>
       <w:bookmarkEnd w:id="32"/>
       <w:r>
         <w:t>Business success criteria</w:t>
@@ -8079,7 +8369,7 @@
       <w:pPr>
         <w:pStyle w:val="Heading1"/>
       </w:pPr>
-      <w:bookmarkStart w:id="37" w:name="_Toc240131121"/>
+      <w:bookmarkStart w:id="37" w:name="_Toc240133375"/>
       <w:r>
         <w:lastRenderedPageBreak/>
         <w:t>Scope and Schedule of Deliverables</w:t>
@@ -8091,7 +8381,7 @@
         <w:pStyle w:val="Heading2"/>
       </w:pPr>
       <w:bookmarkStart w:id="38" w:name="feasibility"/>
-      <w:bookmarkStart w:id="39" w:name="_Toc240131122"/>
+      <w:bookmarkStart w:id="39" w:name="_Toc240133376"/>
       <w:r>
         <w:t>Feasibility</w:t>
       </w:r>
@@ -8189,7 +8479,7 @@
         <w:pStyle w:val="Heading2"/>
       </w:pPr>
       <w:bookmarkStart w:id="40" w:name="scope"/>
-      <w:bookmarkStart w:id="41" w:name="_Toc240131123"/>
+      <w:bookmarkStart w:id="41" w:name="_Toc240133377"/>
       <w:bookmarkEnd w:id="38"/>
       <w:r>
         <w:t>Scope</w:t>
@@ -8217,7 +8507,15 @@
         </w:numPr>
       </w:pPr>
       <w:r>
-        <w:t>Prepared data from the 1,470-record HRIS extract by removing zero-variance and identifier fields, encoding categorical and ordinal variables, and establishing a documented leakage-safe preprocessing pipeline.</w:t>
+        <w:t xml:space="preserve">Prepared data from the 1,470-record HRIS extract by removing zero-variance and </w:t>
+      </w:r>
+      <w:proofErr w:type="gramStart"/>
+      <w:r>
+        <w:t>identifier</w:t>
+      </w:r>
+      <w:proofErr w:type="gramEnd"/>
+      <w:r>
+        <w:t xml:space="preserve"> fields, encoding categorical and ordinal variables, and establishing a documented leakage-safe preprocessing pipeline.</w:t>
       </w:r>
     </w:p>
     <w:p>
@@ -8348,7 +8646,15 @@
         </w:numPr>
       </w:pPr>
       <w:r>
-        <w:t xml:space="preserve">Development of production deployment, HRIS system integration, and user interface build. This serves as a proof of concept; while </w:t>
+        <w:t xml:space="preserve">Development of production deployment, HRIS system integration, and user interface build. This serves as </w:t>
+      </w:r>
+      <w:proofErr w:type="gramStart"/>
+      <w:r>
+        <w:t>a proof</w:t>
+      </w:r>
+      <w:proofErr w:type="gramEnd"/>
+      <w:r>
+        <w:t xml:space="preserve"> of concept; while </w:t>
       </w:r>
       <w:r>
         <w:t xml:space="preserve">the roadmap outlines deployment, it has not been implemented and would require extensive engineering resources beyond </w:t>
@@ -8446,7 +8752,7 @@
         <w:pStyle w:val="Heading2"/>
       </w:pPr>
       <w:bookmarkStart w:id="42" w:name="deliverables-and-schedule"/>
-      <w:bookmarkStart w:id="43" w:name="_Toc240131124"/>
+      <w:bookmarkStart w:id="43" w:name="_Toc240133378"/>
       <w:bookmarkEnd w:id="40"/>
       <w:r>
         <w:t>Deliverables and Schedule</w:t>
@@ -9199,7 +9505,15 @@
         <w:pStyle w:val="BodyText"/>
       </w:pPr>
       <w:r>
-        <w:t>As a sole practitioner, the consultant approves the scope, success criteria, and schedule, subject to review at the two academic check-in points. If a client sponsor is involved, this schedule would require formal countersignatures at Weeks 26 and 46.</w:t>
+        <w:t xml:space="preserve">As a sole practitioner, the consultant approves the scope, success criteria, and schedule, subject to review at the two academic check-in points. If a client sponsor is involved, this schedule would require formal countersignatures </w:t>
+      </w:r>
+      <w:proofErr w:type="gramStart"/>
+      <w:r>
+        <w:t>at</w:t>
+      </w:r>
+      <w:proofErr w:type="gramEnd"/>
+      <w:r>
+        <w:t xml:space="preserve"> Weeks 26 and 46.</w:t>
       </w:r>
     </w:p>
     <w:p>
@@ -9224,7 +9538,7 @@
       <w:pPr>
         <w:pStyle w:val="Heading1"/>
       </w:pPr>
-      <w:bookmarkStart w:id="45" w:name="_Toc240131125"/>
+      <w:bookmarkStart w:id="45" w:name="_Toc240133379"/>
       <w:r>
         <w:lastRenderedPageBreak/>
         <w:t>Data Understanding</w:t>
@@ -9236,7 +9550,7 @@
         <w:pStyle w:val="Heading2"/>
       </w:pPr>
       <w:bookmarkStart w:id="46" w:name="structure-of-the-dataset"/>
-      <w:bookmarkStart w:id="47" w:name="_Toc240131126"/>
+      <w:bookmarkStart w:id="47" w:name="_Toc240133380"/>
       <w:r>
         <w:t>Structure of the dataset</w:t>
       </w:r>
@@ -9253,7 +9567,15 @@
         <w:t>uses a single flat extract containing 1,470 employee records across 35 variables, with one row per</w:t>
       </w:r>
       <w:r>
-        <w:t xml:space="preserve"> employee and no joins needed. This extract covers the entire permanent establishment rather than a sample, eliminating sampling-frame risk.</w:t>
+        <w:t xml:space="preserve"> employee and no </w:t>
+      </w:r>
+      <w:proofErr w:type="gramStart"/>
+      <w:r>
+        <w:t>joins</w:t>
+      </w:r>
+      <w:proofErr w:type="gramEnd"/>
+      <w:r>
+        <w:t xml:space="preserve"> needed. This extract covers the entire permanent establishment rather than a sample, eliminating sampling-frame risk.</w:t>
       </w:r>
     </w:p>
     <w:p>
@@ -9901,12 +10223,14 @@
               <w:pStyle w:val="Compact"/>
               <w:jc w:val="left"/>
             </w:pPr>
+            <w:proofErr w:type="gramStart"/>
             <w:r>
               <w:rPr>
                 <w:rStyle w:val="VerbatimChar"/>
               </w:rPr>
               <w:t>EmployeeCount</w:t>
             </w:r>
+            <w:proofErr w:type="gramEnd"/>
             <w:r>
               <w:t xml:space="preserve">, </w:t>
             </w:r>
@@ -9960,7 +10284,7 @@
         <w:pStyle w:val="Heading2"/>
       </w:pPr>
       <w:bookmarkStart w:id="48" w:name="the-target-variable-and-its-time-anchor"/>
-      <w:bookmarkStart w:id="49" w:name="_Toc240131127"/>
+      <w:bookmarkStart w:id="49" w:name="_Toc240133381"/>
       <w:bookmarkEnd w:id="46"/>
       <w:r>
         <w:t>The target variable and its time anchor</w:t>
@@ -9986,7 +10310,15 @@
         <w:pStyle w:val="BodyText"/>
       </w:pPr>
       <w:r>
-        <w:t>This figure represents prevalence, not a rate, and this difference is crucial for all financial figures in this report. The record shows when an employee left, but not the timing or the period over which the 237 departures occurred. The 16.12% figure is only an annual attrition rate if all departures happened within a single year—an assumption that the data neither confirms nor denies.</w:t>
+        <w:t xml:space="preserve">This figure represents prevalence, not a rate, and this difference is crucial for all financial figures in this report. The record shows when an employee left, but not the timing or the period over which </w:t>
+      </w:r>
+      <w:proofErr w:type="gramStart"/>
+      <w:r>
+        <w:t>the 237</w:t>
+      </w:r>
+      <w:proofErr w:type="gramEnd"/>
+      <w:r>
+        <w:t xml:space="preserve"> departures occurred. The 16.12% figure is only an annual attrition rate if all departures happened within a single year—an assumption that the data neither confirms nor denies.</w:t>
       </w:r>
     </w:p>
     <w:p>
@@ -10020,7 +10352,7 @@
         <w:pStyle w:val="Heading2"/>
       </w:pPr>
       <w:bookmarkStart w:id="50" w:name="overall-observations"/>
-      <w:bookmarkStart w:id="51" w:name="_Toc240131128"/>
+      <w:bookmarkStart w:id="51" w:name="_Toc240133382"/>
       <w:bookmarkEnd w:id="48"/>
       <w:r>
         <w:t>Overall observations</w:t>
@@ -10048,7 +10380,7 @@
         <w:pStyle w:val="Heading2"/>
       </w:pPr>
       <w:bookmarkStart w:id="52" w:name="data-preparation"/>
-      <w:bookmarkStart w:id="53" w:name="_Toc240131129"/>
+      <w:bookmarkStart w:id="53" w:name="_Toc240133383"/>
       <w:bookmarkEnd w:id="50"/>
       <w:r>
         <w:t>Data Preparation</w:t>
@@ -10492,6 +10824,7 @@
         <w:t xml:space="preserve">— into a one-hot encoded format using </w:t>
       </w:r>
       <w:proofErr w:type="spellStart"/>
+      <w:proofErr w:type="gramStart"/>
       <w:r>
         <w:rPr>
           <w:rFonts w:ascii="Consolas" w:hAnsi="Consolas"/>
@@ -10507,71 +10840,37 @@
           <w:sz w:val="22"/>
           <w:szCs w:val="22"/>
         </w:rPr>
-        <w:t xml:space="preserve">(drop='first', </w:t>
-      </w:r>
-      <w:proofErr w:type="spellStart"/>
+        <w:t>(</w:t>
+      </w:r>
+      <w:proofErr w:type="gramEnd"/>
       <w:r>
         <w:rPr>
           <w:rFonts w:ascii="Consolas" w:hAnsi="Consolas"/>
           <w:sz w:val="22"/>
           <w:szCs w:val="22"/>
         </w:rPr>
-        <w:t>handle_unknown</w:t>
-      </w:r>
-      <w:proofErr w:type="spellEnd"/>
+        <w:t xml:space="preserve">drop='first', </w:t>
+      </w:r>
+      <w:proofErr w:type="spellStart"/>
       <w:r>
         <w:rPr>
           <w:rFonts w:ascii="Consolas" w:hAnsi="Consolas"/>
           <w:sz w:val="22"/>
           <w:szCs w:val="22"/>
         </w:rPr>
-        <w:t>='ignore')</w:t>
-      </w:r>
-      <w:r>
-        <w:t>. Dropping the first category prevents the dummy variable trap, while ignoring unknown categories ensures that unseen values during scoring generate an all-zero vector instead of triggering an error in production.</w:t>
-      </w:r>
-    </w:p>
-    <w:p>
-      <w:pPr>
-        <w:pStyle w:val="BodyText"/>
-      </w:pPr>
-      <w:r>
-        <w:t xml:space="preserve">I chose not to use ordinal encoding for these fields. </w:t>
-      </w:r>
-      <w:proofErr w:type="spellStart"/>
+        <w:t>handle_unknown</w:t>
+      </w:r>
+      <w:proofErr w:type="spellEnd"/>
       <w:r>
         <w:rPr>
           <w:rFonts w:ascii="Consolas" w:hAnsi="Consolas"/>
           <w:sz w:val="22"/>
           <w:szCs w:val="22"/>
         </w:rPr>
-        <w:t>BusinessTravel</w:t>
-      </w:r>
-      <w:proofErr w:type="spellEnd"/>
-      <w:r>
-        <w:rPr>
-          <w:sz w:val="22"/>
-          <w:szCs w:val="22"/>
-        </w:rPr>
-        <w:t xml:space="preserve"> </w:t>
-      </w:r>
-      <w:r>
-        <w:t xml:space="preserve">illustrates why: its three levels have increasing departure rates (8.0%, 15.0%, 24.9%), but integer encoding would incorrectly assume equal spacing, which the data </w:t>
-      </w:r>
-      <w:r>
-        <w:t>do not</w:t>
-      </w:r>
-      <w:r>
-        <w:t xml:space="preserve"> support</w:t>
-      </w:r>
-      <w:r>
-        <w:t xml:space="preserve">. One-hot encoding </w:t>
-      </w:r>
-      <w:r>
-        <w:t>lets the model learn the actual spacing rather than assume</w:t>
-      </w:r>
-      <w:r>
-        <w:t xml:space="preserve"> it.</w:t>
+        <w:t>='ignore')</w:t>
+      </w:r>
+      <w:r>
+        <w:t>. Dropping the first category prevents the dummy variable trap, while ignoring unknown categories ensures that unseen values during scoring generate an all-zero vector instead of triggering an error in production.</w:t>
       </w:r>
     </w:p>
     <w:p>
@@ -10579,109 +10878,7 @@
         <w:pStyle w:val="BodyText"/>
       </w:pPr>
       <w:r>
-        <w:t xml:space="preserve">The ordinal Likert instruments — </w:t>
-      </w:r>
-      <w:r>
-        <w:rPr>
-          <w:rStyle w:val="VerbatimChar"/>
-        </w:rPr>
-        <w:t>JobSatisfaction</w:t>
-      </w:r>
-      <w:r>
-        <w:t xml:space="preserve">, </w:t>
-      </w:r>
-      <w:r>
-        <w:rPr>
-          <w:rStyle w:val="VerbatimChar"/>
-        </w:rPr>
-        <w:t>EnvironmentSatisfaction</w:t>
-      </w:r>
-      <w:r>
-        <w:t xml:space="preserve">, </w:t>
-      </w:r>
-      <w:r>
-        <w:rPr>
-          <w:rStyle w:val="VerbatimChar"/>
-        </w:rPr>
-        <w:t>RelationshipSatisfaction</w:t>
-      </w:r>
-      <w:r>
-        <w:t xml:space="preserve">, </w:t>
-      </w:r>
-      <w:r>
-        <w:rPr>
-          <w:rStyle w:val="VerbatimChar"/>
-        </w:rPr>
-        <w:t>JobInvolvement</w:t>
-      </w:r>
-      <w:r>
-        <w:t xml:space="preserve">, </w:t>
-      </w:r>
-      <w:r>
-        <w:rPr>
-          <w:rStyle w:val="VerbatimChar"/>
-        </w:rPr>
-        <w:t>WorkLifeBalance</w:t>
-      </w:r>
-      <w:r>
-        <w:t xml:space="preserve">, </w:t>
-      </w:r>
-      <w:r>
-        <w:rPr>
-          <w:rStyle w:val="VerbatimChar"/>
-        </w:rPr>
-        <w:t>PerformanceRating</w:t>
-      </w:r>
-      <w:r>
-        <w:t xml:space="preserve">, </w:t>
-      </w:r>
-      <w:r>
-        <w:rPr>
-          <w:rStyle w:val="VerbatimChar"/>
-        </w:rPr>
-        <w:t>Education</w:t>
-      </w:r>
-      <w:r>
-        <w:t xml:space="preserve">, </w:t>
-      </w:r>
-      <w:r>
-        <w:rPr>
-          <w:rStyle w:val="VerbatimChar"/>
-        </w:rPr>
-        <w:t>JobLevel</w:t>
-      </w:r>
-      <w:r>
-        <w:t xml:space="preserve">, </w:t>
-      </w:r>
-      <w:r>
-        <w:rPr>
-          <w:rStyle w:val="VerbatimChar"/>
-        </w:rPr>
-        <w:t>StockOptionLevel</w:t>
-      </w:r>
-      <w:r>
-        <w:t xml:space="preserve"> — are retained on their native integer scales and treated as numeric, preserving ordinality without a large increase in dimensionality </w:t>
-      </w:r>
-      <w:r>
-        <w:t>compared to</w:t>
-      </w:r>
-      <w:r>
-        <w:t xml:space="preserve"> a small positive class.</w:t>
-      </w:r>
-    </w:p>
-    <w:p>
-      <w:pPr>
-        <w:pStyle w:val="BodyText"/>
-      </w:pPr>
-      <w:r>
-        <w:rPr>
-          <w:b/>
-          <w:bCs/>
-        </w:rPr>
-        <w:t>Scaling:</w:t>
-      </w:r>
-      <w:r>
-        <w:t xml:space="preserve"> All 21 numeric features are standardized using </w:t>
+        <w:t xml:space="preserve">I chose not to use ordinal encoding for these fields. </w:t>
       </w:r>
       <w:proofErr w:type="spellStart"/>
       <w:r>
@@ -10690,11 +10887,143 @@
           <w:sz w:val="22"/>
           <w:szCs w:val="22"/>
         </w:rPr>
-        <w:t>StandardScaler</w:t>
+        <w:t>BusinessTravel</w:t>
       </w:r>
       <w:proofErr w:type="spellEnd"/>
       <w:r>
-        <w:t xml:space="preserve">, which is essential for the analysis. The core model is an L2-regularized logistic regression, where the L2 penalty diminishes coefficients relative to their size, inversely related to feature scale. Raw features include </w:t>
+        <w:rPr>
+          <w:sz w:val="22"/>
+          <w:szCs w:val="22"/>
+        </w:rPr>
+        <w:t xml:space="preserve"> </w:t>
+      </w:r>
+      <w:r>
+        <w:t xml:space="preserve">illustrates why: its three levels have increasing departure rates (8.0%, 15.0%, 24.9%), but integer encoding would incorrectly assume equal spacing, which the data </w:t>
+      </w:r>
+      <w:r>
+        <w:t>do not</w:t>
+      </w:r>
+      <w:r>
+        <w:t xml:space="preserve"> support</w:t>
+      </w:r>
+      <w:r>
+        <w:t xml:space="preserve">. One-hot encoding </w:t>
+      </w:r>
+      <w:r>
+        <w:t>lets the model learn the actual spacing rather than assume</w:t>
+      </w:r>
+      <w:r>
+        <w:t xml:space="preserve"> it.</w:t>
+      </w:r>
+    </w:p>
+    <w:p>
+      <w:pPr>
+        <w:pStyle w:val="BodyText"/>
+      </w:pPr>
+      <w:r>
+        <w:t xml:space="preserve">The ordinal Likert instruments — </w:t>
+      </w:r>
+      <w:r>
+        <w:rPr>
+          <w:rStyle w:val="VerbatimChar"/>
+        </w:rPr>
+        <w:t>JobSatisfaction</w:t>
+      </w:r>
+      <w:r>
+        <w:t xml:space="preserve">, </w:t>
+      </w:r>
+      <w:r>
+        <w:rPr>
+          <w:rStyle w:val="VerbatimChar"/>
+        </w:rPr>
+        <w:t>EnvironmentSatisfaction</w:t>
+      </w:r>
+      <w:r>
+        <w:t xml:space="preserve">, </w:t>
+      </w:r>
+      <w:r>
+        <w:rPr>
+          <w:rStyle w:val="VerbatimChar"/>
+        </w:rPr>
+        <w:t>RelationshipSatisfaction</w:t>
+      </w:r>
+      <w:r>
+        <w:t xml:space="preserve">, </w:t>
+      </w:r>
+      <w:r>
+        <w:rPr>
+          <w:rStyle w:val="VerbatimChar"/>
+        </w:rPr>
+        <w:t>JobInvolvement</w:t>
+      </w:r>
+      <w:r>
+        <w:t xml:space="preserve">, </w:t>
+      </w:r>
+      <w:r>
+        <w:rPr>
+          <w:rStyle w:val="VerbatimChar"/>
+        </w:rPr>
+        <w:t>WorkLifeBalance</w:t>
+      </w:r>
+      <w:r>
+        <w:t xml:space="preserve">, </w:t>
+      </w:r>
+      <w:r>
+        <w:rPr>
+          <w:rStyle w:val="VerbatimChar"/>
+        </w:rPr>
+        <w:t>PerformanceRating</w:t>
+      </w:r>
+      <w:r>
+        <w:t xml:space="preserve">, </w:t>
+      </w:r>
+      <w:r>
+        <w:rPr>
+          <w:rStyle w:val="VerbatimChar"/>
+        </w:rPr>
+        <w:t>Education</w:t>
+      </w:r>
+      <w:r>
+        <w:t xml:space="preserve">, </w:t>
+      </w:r>
+      <w:r>
+        <w:rPr>
+          <w:rStyle w:val="VerbatimChar"/>
+        </w:rPr>
+        <w:t>JobLevel</w:t>
+      </w:r>
+      <w:r>
+        <w:t xml:space="preserve">, </w:t>
+      </w:r>
+      <w:r>
+        <w:rPr>
+          <w:rStyle w:val="VerbatimChar"/>
+        </w:rPr>
+        <w:t>StockOptionLevel</w:t>
+      </w:r>
+      <w:r>
+        <w:t xml:space="preserve"> — are retained on their native integer scales and treated as numeric, preserving ordinality without a large increase in dimensionality </w:t>
+      </w:r>
+      <w:r>
+        <w:t>compared to</w:t>
+      </w:r>
+      <w:r>
+        <w:t xml:space="preserve"> a small positive class.</w:t>
+      </w:r>
+    </w:p>
+    <w:p>
+      <w:pPr>
+        <w:pStyle w:val="BodyText"/>
+      </w:pPr>
+      <w:r>
+        <w:rPr>
+          <w:b/>
+          <w:bCs/>
+        </w:rPr>
+        <w:t>Scaling:</w:t>
+      </w:r>
+      <w:r>
+        <w:t xml:space="preserve"> All 21 numeric features are standardized using </w:t>
       </w:r>
       <w:proofErr w:type="spellStart"/>
       <w:r>
@@ -10703,11 +11032,11 @@
           <w:sz w:val="22"/>
           <w:szCs w:val="22"/>
         </w:rPr>
-        <w:t>MonthlyIncome</w:t>
+        <w:t>StandardScaler</w:t>
       </w:r>
       <w:proofErr w:type="spellEnd"/>
       <w:r>
-        <w:t xml:space="preserve">, ranging from $1,009 to $19,999, and </w:t>
+        <w:t xml:space="preserve">, which is essential for the analysis. The core model is an L2-regularized logistic regression, where the L2 penalty diminishes coefficients relative to their size, inversely related to feature scale. Raw features include </w:t>
       </w:r>
       <w:proofErr w:type="spellStart"/>
       <w:r>
@@ -10716,72 +11045,11 @@
           <w:sz w:val="22"/>
           <w:szCs w:val="22"/>
         </w:rPr>
-        <w:t>JobInvolvement</w:t>
+        <w:t>MonthlyIncome</w:t>
       </w:r>
       <w:proofErr w:type="spellEnd"/>
       <w:r>
-        <w:rPr>
-          <w:sz w:val="22"/>
-          <w:szCs w:val="22"/>
-        </w:rPr>
-        <w:t xml:space="preserve"> </w:t>
-      </w:r>
-      <w:r>
-        <w:t>from 1 to 4. Without scaling, the penalty mainly affects satisfaction variables, leaving income largely unregularized</w:t>
-      </w:r>
-      <w:r>
-        <w:t xml:space="preserve"> and making variable selection sensitive to</w:t>
-      </w:r>
-      <w:r>
-        <w:t xml:space="preserve"> </w:t>
-      </w:r>
-      <w:r>
-        <w:t>units of measurement</w:t>
-      </w:r>
-      <w:r>
-        <w:t>. Standardization also makes coefficients directly comparable as effect sizes, ensuring per-employee attribution is interpretable.</w:t>
-      </w:r>
-    </w:p>
-    <w:p>
-      <w:pPr>
-        <w:pStyle w:val="BodyText"/>
-      </w:pPr>
-      <w:r>
-        <w:rPr>
-          <w:b/>
-          <w:bCs/>
-        </w:rPr>
-        <w:t>Leakage control:</w:t>
-      </w:r>
-      <w:r>
-        <w:t xml:space="preserve"> The scaler and encoder are included only within the training pipeline, not fitted on the entire dataset beforehand. Fitting the scaler on the full dataset prior to splitting would leak the evaluation set’s distributional data into training, artificially boosting all metrics. Embedding the transformation within the pipeline </w:t>
-      </w:r>
-      <w:r>
-        <w:t>prevents this leakage</w:t>
-      </w:r>
-      <w:r>
-        <w:t xml:space="preserve">, making it a built-in safeguard rather than relying </w:t>
-      </w:r>
-      <w:r>
-        <w:t>on discipline alone</w:t>
-      </w:r>
-      <w:r>
-        <w:t>.</w:t>
-      </w:r>
-    </w:p>
-    <w:p>
-      <w:pPr>
-        <w:pStyle w:val="BodyText"/>
-      </w:pPr>
-      <w:r>
-        <w:rPr>
-          <w:b/>
-          <w:bCs/>
-        </w:rPr>
-        <w:t>Data quality</w:t>
-      </w:r>
-      <w:r>
-        <w:t xml:space="preserve"> is confirmed with no duplicate identifiers and no out-of-range values in any ordinal instrument. </w:t>
+        <w:t xml:space="preserve">, ranging from $1,009 to $19,999, and </w:t>
       </w:r>
       <w:proofErr w:type="spellStart"/>
       <w:r>
@@ -10790,9 +11058,93 @@
           <w:sz w:val="22"/>
           <w:szCs w:val="22"/>
         </w:rPr>
+        <w:t>JobInvolvement</w:t>
+      </w:r>
+      <w:proofErr w:type="spellEnd"/>
+      <w:r>
+        <w:rPr>
+          <w:sz w:val="22"/>
+          <w:szCs w:val="22"/>
+        </w:rPr>
+        <w:t xml:space="preserve"> </w:t>
+      </w:r>
+      <w:r>
+        <w:t>from 1 to 4. Without scaling, the penalty mainly affects satisfaction variables, leaving income largely unregularized</w:t>
+      </w:r>
+      <w:r>
+        <w:t xml:space="preserve"> and making variable selection sensitive to</w:t>
+      </w:r>
+      <w:r>
+        <w:t xml:space="preserve"> </w:t>
+      </w:r>
+      <w:r>
+        <w:t>units of measurement</w:t>
+      </w:r>
+      <w:r>
+        <w:t xml:space="preserve">. Standardization also makes coefficients directly comparable </w:t>
+      </w:r>
+      <w:proofErr w:type="gramStart"/>
+      <w:r>
+        <w:t>as</w:t>
+      </w:r>
+      <w:proofErr w:type="gramEnd"/>
+      <w:r>
+        <w:t xml:space="preserve"> effect sizes, ensuring per-employee attribution is interpretable.</w:t>
+      </w:r>
+    </w:p>
+    <w:p>
+      <w:pPr>
+        <w:pStyle w:val="BodyText"/>
+      </w:pPr>
+      <w:r>
+        <w:rPr>
+          <w:b/>
+          <w:bCs/>
+        </w:rPr>
+        <w:t>Leakage control:</w:t>
+      </w:r>
+      <w:r>
+        <w:t xml:space="preserve"> The scaler and encoder are included only within the training pipeline, not fitted on the entire dataset beforehand. Fitting the scaler on the full dataset prior to splitting would leak the evaluation set’s distributional data into training, artificially boosting all metrics. Embedding the transformation within the pipeline </w:t>
+      </w:r>
+      <w:r>
+        <w:t>prevents this leakage</w:t>
+      </w:r>
+      <w:r>
+        <w:t xml:space="preserve">, making it a built-in safeguard rather than relying </w:t>
+      </w:r>
+      <w:r>
+        <w:t>on discipline alone</w:t>
+      </w:r>
+      <w:r>
+        <w:t>.</w:t>
+      </w:r>
+    </w:p>
+    <w:p>
+      <w:pPr>
+        <w:pStyle w:val="BodyText"/>
+      </w:pPr>
+      <w:r>
+        <w:rPr>
+          <w:b/>
+          <w:bCs/>
+        </w:rPr>
+        <w:t>Data quality</w:t>
+      </w:r>
+      <w:r>
+        <w:t xml:space="preserve"> is confirmed with no duplicate identifiers and no out-of-range values in any ordinal instrument. </w:t>
+      </w:r>
+      <w:proofErr w:type="spellStart"/>
+      <w:proofErr w:type="gramStart"/>
+      <w:r>
+        <w:rPr>
+          <w:rFonts w:ascii="Consolas" w:hAnsi="Consolas"/>
+          <w:sz w:val="22"/>
+          <w:szCs w:val="22"/>
+        </w:rPr>
         <w:t>MonthlyIncome</w:t>
       </w:r>
       <w:proofErr w:type="spellEnd"/>
+      <w:proofErr w:type="gramEnd"/>
       <w:r>
         <w:rPr>
           <w:sz w:val="22"/>
@@ -10832,7 +11184,7 @@
       <w:pPr>
         <w:pStyle w:val="Heading1"/>
       </w:pPr>
-      <w:bookmarkStart w:id="55" w:name="_Toc240131130"/>
+      <w:bookmarkStart w:id="55" w:name="_Toc240133384"/>
       <w:r>
         <w:lastRenderedPageBreak/>
         <w:t>Exploratory Data Analysis</w:t>
@@ -10844,7 +11196,15 @@
         <w:pStyle w:val="FirstParagraph"/>
       </w:pPr>
       <w:r>
-        <w:t>All exploratory analysis was performed in Python, utilizing pandas for data aggregation and seaborn with matplotlib for visualization. The script provided regenerates every figure in this report, ensuring the document and the code stay aligned.</w:t>
+        <w:t xml:space="preserve">All </w:t>
+      </w:r>
+      <w:proofErr w:type="gramStart"/>
+      <w:r>
+        <w:t>exploratory</w:t>
+      </w:r>
+      <w:proofErr w:type="gramEnd"/>
+      <w:r>
+        <w:t xml:space="preserve"> analysis was performed in Python, utilizing pandas for data aggregation and seaborn with matplotlib for visualization. The script provided regenerates every figure in this report, ensuring the document and the code stay aligned.</w:t>
       </w:r>
     </w:p>
     <w:p>
@@ -10852,7 +11212,7 @@
         <w:pStyle w:val="Heading2"/>
       </w:pPr>
       <w:bookmarkStart w:id="56" w:name="principal-finding-overtime"/>
-      <w:bookmarkStart w:id="57" w:name="_Toc240131131"/>
+      <w:bookmarkStart w:id="57" w:name="_Toc240133385"/>
       <w:r>
         <w:t>Principal finding: overtime</w:t>
       </w:r>
@@ -10930,10 +11290,18 @@
         <w:pStyle w:val="Heading2"/>
       </w:pPr>
       <w:bookmarkStart w:id="58" w:name="principal-finding-compensation"/>
-      <w:bookmarkStart w:id="59" w:name="_Toc240131132"/>
+      <w:bookmarkStart w:id="59" w:name="_Toc240133386"/>
       <w:bookmarkEnd w:id="56"/>
       <w:r>
-        <w:t>Principal finding: compensation</w:t>
+        <w:t xml:space="preserve">Principal </w:t>
+      </w:r>
+      <w:proofErr w:type="gramStart"/>
+      <w:r>
+        <w:t>finding</w:t>
+      </w:r>
+      <w:proofErr w:type="gramEnd"/>
+      <w:r>
+        <w:t>: compensation</w:t>
       </w:r>
       <w:bookmarkEnd w:id="59"/>
     </w:p>
@@ -11035,7 +11403,7 @@
         <w:pStyle w:val="Heading2"/>
       </w:pPr>
       <w:bookmarkStart w:id="60" w:name="correlation-structure"/>
-      <w:bookmarkStart w:id="61" w:name="_Toc240131133"/>
+      <w:bookmarkStart w:id="61" w:name="_Toc240133387"/>
       <w:bookmarkEnd w:id="58"/>
       <w:r>
         <w:t>Correlation structure</w:t>
@@ -11176,7 +11544,7 @@
         <w:pStyle w:val="Heading2"/>
       </w:pPr>
       <w:bookmarkStart w:id="62" w:name="supporting-findings"/>
-      <w:bookmarkStart w:id="63" w:name="_Toc240131134"/>
+      <w:bookmarkStart w:id="63" w:name="_Toc240133388"/>
       <w:bookmarkEnd w:id="60"/>
       <w:r>
         <w:t>Supporting findings</w:t>
@@ -11307,8 +11675,21 @@
         <w:t xml:space="preserve">Job Satisfaction. Exit rates </w:t>
       </w:r>
       <w:r>
-        <w:t>drop from 22.8% at the lowest satisfaction ratings to 11.3% at</w:t>
-      </w:r>
+        <w:t xml:space="preserve">drop from 22.8% </w:t>
+      </w:r>
+      <w:proofErr w:type="gramStart"/>
+      <w:r>
+        <w:t>at</w:t>
+      </w:r>
+      <w:proofErr w:type="gramEnd"/>
+      <w:r>
+        <w:t xml:space="preserve"> the lowest satisfaction ratings to 11.3% </w:t>
+      </w:r>
+      <w:proofErr w:type="gramStart"/>
+      <w:r>
+        <w:t>at</w:t>
+      </w:r>
+      <w:proofErr w:type="gramEnd"/>
       <w:r>
         <w:t xml:space="preserve"> the highest. While the difference is meaningful, it is moderate and less variable than behavioral factors like </w:t>
       </w:r>
@@ -11408,7 +11789,7 @@
         <w:pStyle w:val="Heading2"/>
       </w:pPr>
       <w:bookmarkStart w:id="64" w:name="data-sufficiency"/>
-      <w:bookmarkStart w:id="65" w:name="_Toc240131135"/>
+      <w:bookmarkStart w:id="65" w:name="_Toc240133389"/>
       <w:bookmarkEnd w:id="62"/>
       <w:r>
         <w:t>Data sufficiency</w:t>
@@ -11446,7 +11827,7 @@
         <w:pStyle w:val="Heading2"/>
       </w:pPr>
       <w:bookmarkStart w:id="66" w:name="follow-up-questions-for-the-client"/>
-      <w:bookmarkStart w:id="67" w:name="_Toc240131136"/>
+      <w:bookmarkStart w:id="67" w:name="_Toc240133390"/>
       <w:bookmarkEnd w:id="64"/>
       <w:r>
         <w:t>Follow-up questions for the client</w:t>
@@ -11461,8 +11842,13 @@
           <w:numId w:val="13"/>
         </w:numPr>
       </w:pPr>
-      <w:r>
-        <w:t xml:space="preserve">Over what timeframe were these departures documented, and can the HRIS provide date-stamped joiner and leaver data? This is the most important question, as it turns the report’s main assumption into a quantifiable metric. </w:t>
+      <w:proofErr w:type="gramStart"/>
+      <w:r>
+        <w:t>Over what</w:t>
+      </w:r>
+      <w:proofErr w:type="gramEnd"/>
+      <w:r>
+        <w:t xml:space="preserve"> timeframe were these departures documented, and can the HRIS provide date-stamped joiner and leaver data? This is the most important question, as it turns the report’s main assumption into a quantifiable metric. </w:t>
       </w:r>
     </w:p>
     <w:p>
@@ -11563,7 +11949,15 @@
         </w:numPr>
       </w:pPr>
       <w:r>
-        <w:t>What intervention options are actually available to HR business partners, and what has been the success rate of each in the past?</w:t>
+        <w:t xml:space="preserve">What intervention options are </w:t>
+      </w:r>
+      <w:proofErr w:type="gramStart"/>
+      <w:r>
+        <w:t>actually available</w:t>
+      </w:r>
+      <w:proofErr w:type="gramEnd"/>
+      <w:r>
+        <w:t xml:space="preserve"> to HR business partners, and what has been the success rate of each in the past?</w:t>
       </w:r>
     </w:p>
     <w:p>
@@ -11588,7 +11982,7 @@
       <w:pPr>
         <w:pStyle w:val="Heading1"/>
       </w:pPr>
-      <w:bookmarkStart w:id="69" w:name="_Toc240131137"/>
+      <w:bookmarkStart w:id="69" w:name="_Toc240133391"/>
       <w:r>
         <w:lastRenderedPageBreak/>
         <w:t>Methods and Frameworks</w:t>
@@ -11600,7 +11994,7 @@
         <w:pStyle w:val="Heading2"/>
       </w:pPr>
       <w:bookmarkStart w:id="70" w:name="overall-approach"/>
-      <w:bookmarkStart w:id="71" w:name="_Toc240131138"/>
+      <w:bookmarkStart w:id="71" w:name="_Toc240133392"/>
       <w:r>
         <w:t>Overall Approach</w:t>
       </w:r>
@@ -11671,7 +12065,15 @@
         </w:numPr>
       </w:pPr>
       <w:r>
-        <w:t>Fairness and proxy analysis — assess the impact of ethical exclusions and check for disparate impact.</w:t>
+        <w:t xml:space="preserve">Fairness and proxy analysis — assess the impact of ethical exclusions and </w:t>
+      </w:r>
+      <w:proofErr w:type="gramStart"/>
+      <w:r>
+        <w:t>check</w:t>
+      </w:r>
+      <w:proofErr w:type="gramEnd"/>
+      <w:r>
+        <w:t xml:space="preserve"> for disparate impact.</w:t>
       </w:r>
     </w:p>
     <w:p>
@@ -11749,7 +12151,15 @@
         <w:t>—about 3.10 for positives and 0.60 for negatives, a ratio of roughly 5.2:1 —</w:t>
       </w:r>
       <w:r>
-        <w:t xml:space="preserve">shifting the decision boundary toward the minority class. While this helps, it still underestimates the true business cost ratio, so explicit threshold tuning is needed after fitting </w:t>
+        <w:t xml:space="preserve">shifting the decision boundary toward the minority class. While this helps, it still underestimates the true business cost ratio, so explicit threshold tuning is needed after </w:t>
+      </w:r>
+      <w:proofErr w:type="gramStart"/>
+      <w:r>
+        <w:t>fitting</w:t>
+      </w:r>
+      <w:proofErr w:type="gramEnd"/>
+      <w:r>
+        <w:t xml:space="preserve"> </w:t>
       </w:r>
       <w:r>
         <w:t>to close the gap fully</w:t>
@@ -11763,7 +12173,15 @@
         <w:pStyle w:val="FirstParagraph"/>
       </w:pPr>
       <w:r>
-        <w:t xml:space="preserve">Resampling methods like SMOTE were considered but rejected because they generate synthetic employees by interpolating features, which is unreliable given the many one-hot and coarse ordinal features — such synthetic examples could not exist in reality. </w:t>
+        <w:t xml:space="preserve">Resampling methods like SMOTE were considered but rejected because they generate synthetic employees by interpolating features, which is unreliable given the many one-hot and coarse ordinal features — such synthetic examples could not </w:t>
+      </w:r>
+      <w:proofErr w:type="gramStart"/>
+      <w:r>
+        <w:t>exist in reality</w:t>
+      </w:r>
+      <w:proofErr w:type="gramEnd"/>
+      <w:r>
+        <w:t xml:space="preserve">. </w:t>
       </w:r>
       <w:proofErr w:type="spellStart"/>
       <w:r>
@@ -11779,7 +12197,15 @@
         <w:pStyle w:val="FirstParagraph"/>
       </w:pPr>
       <w:r>
-        <w:t xml:space="preserve">Why opt for nested cross-validation over a simple train/test split? Because threshold tuning involves parameter optimization, and doing it on the same data used for performance evaluation introduces bias. This </w:t>
+        <w:t xml:space="preserve">Why opt for nested cross-validation over a simple train/test split? Because threshold tuning involves parameter </w:t>
+      </w:r>
+      <w:proofErr w:type="gramStart"/>
+      <w:r>
+        <w:t>optimization, and</w:t>
+      </w:r>
+      <w:proofErr w:type="gramEnd"/>
+      <w:r>
+        <w:t xml:space="preserve"> doing it on the same data used for performance evaluation introduces bias. This </w:t>
       </w:r>
       <w:r>
         <w:t>makes the test set act as a validation set, compromising</w:t>
@@ -11898,13 +12324,7 @@
                   <w:rPr>
                     <w:rFonts w:ascii="Cambria Math" w:hAnsi="Cambria Math"/>
                   </w:rPr>
-                  <m:t>benefit=1.5 ∙effectiveness ∙</m:t>
-                </m:r>
-                <m:r>
-                  <w:rPr>
-                    <w:rFonts w:ascii="Cambria Math" w:hAnsi="Cambria Math"/>
-                  </w:rPr>
-                  <m:t>TP ∙salary</m:t>
+                  <m:t>benefit=1.5 ∙effectiveness ∙TP ∙salary</m:t>
                 </m:r>
               </m:oMath>
             </m:oMathPara>
@@ -11992,7 +12412,7 @@
         <w:pStyle w:val="Heading2"/>
       </w:pPr>
       <w:bookmarkStart w:id="72" w:name="tools-and-technologies"/>
-      <w:bookmarkStart w:id="73" w:name="_Toc240131139"/>
+      <w:bookmarkStart w:id="73" w:name="_Toc240133393"/>
       <w:bookmarkEnd w:id="70"/>
       <w:r>
         <w:t>Tools and Technologies</w:t>
@@ -12470,7 +12890,23 @@
         <w:t>it is</w:t>
       </w:r>
       <w:r>
-        <w:t xml:space="preserve"> directly interpretable, with each standardized coefficient representing a comparable log-odds effect size; it is properly regularized for a small positive class and provides calibrated probabilities, essential for the expected-loss ranking. Meanwhile, the random forest serves as the ensemble alternative, </w:t>
+        <w:t xml:space="preserve"> directly interpretable, with each standardized coefficient representing a comparable log-odds effect size; it is properly regularized for a small positive class and provides calibrated probabilities, essential for the </w:t>
+      </w:r>
+      <w:proofErr w:type="gramStart"/>
+      <w:r>
+        <w:t>expected-loss</w:t>
+      </w:r>
+      <w:proofErr w:type="gramEnd"/>
+      <w:r>
+        <w:t xml:space="preserve"> ranking. Meanwhile, the random forest serves as </w:t>
+      </w:r>
+      <w:proofErr w:type="gramStart"/>
+      <w:r>
+        <w:t>the</w:t>
+      </w:r>
+      <w:proofErr w:type="gramEnd"/>
+      <w:r>
+        <w:t xml:space="preserve"> ensemble alternative, </w:t>
       </w:r>
       <w:r>
         <w:t>can model non-linearity and interactions automatically,</w:t>
@@ -12484,7 +12920,7 @@
         <w:pStyle w:val="Heading2"/>
       </w:pPr>
       <w:bookmarkStart w:id="74" w:name="Xfd7ed6f3863d15655ce690eac3d46ac191430bb"/>
-      <w:bookmarkStart w:id="75" w:name="_Toc240131140"/>
+      <w:bookmarkStart w:id="75" w:name="_Toc240133394"/>
       <w:bookmarkEnd w:id="72"/>
       <w:r>
         <w:lastRenderedPageBreak/>
@@ -12915,7 +13351,7 @@
       <w:pPr>
         <w:pStyle w:val="Heading1"/>
       </w:pPr>
-      <w:bookmarkStart w:id="77" w:name="_Toc240131141"/>
+      <w:bookmarkStart w:id="77" w:name="_Toc240133395"/>
       <w:r>
         <w:lastRenderedPageBreak/>
         <w:t>Architect the Solution: Proof of Concept</w:t>
@@ -12927,7 +13363,7 @@
         <w:pStyle w:val="Heading2"/>
       </w:pPr>
       <w:bookmarkStart w:id="78" w:name="pipeline-construction"/>
-      <w:bookmarkStart w:id="79" w:name="_Toc240131142"/>
+      <w:bookmarkStart w:id="79" w:name="_Toc240133396"/>
       <w:r>
         <w:t>Pipeline construction</w:t>
       </w:r>
@@ -13026,7 +13462,7 @@
         <w:pStyle w:val="Heading2"/>
       </w:pPr>
       <w:bookmarkStart w:id="80" w:name="model-comparison"/>
-      <w:bookmarkStart w:id="81" w:name="_Toc240131143"/>
+      <w:bookmarkStart w:id="81" w:name="_Toc240133397"/>
       <w:bookmarkEnd w:id="78"/>
       <w:r>
         <w:t>Model comparison</w:t>
@@ -13269,7 +13705,15 @@
         <w:t>setting</w:t>
       </w:r>
       <w:r>
-        <w:t xml:space="preserve"> it well above the default 0.50. We select the median threshold of 0.60.</w:t>
+        <w:t xml:space="preserve"> it well above the default 0.50. We </w:t>
+      </w:r>
+      <w:proofErr w:type="gramStart"/>
+      <w:r>
+        <w:t>select</w:t>
+      </w:r>
+      <w:proofErr w:type="gramEnd"/>
+      <w:r>
+        <w:t xml:space="preserve"> the median threshold of 0.60.</w:t>
       </w:r>
     </w:p>
     <w:p>
@@ -13277,7 +13721,7 @@
         <w:pStyle w:val="Heading2"/>
       </w:pPr>
       <w:bookmarkStart w:id="82" w:name="out-of-fold-performance"/>
-      <w:bookmarkStart w:id="83" w:name="_Toc240131144"/>
+      <w:bookmarkStart w:id="83" w:name="_Toc240133398"/>
       <w:bookmarkEnd w:id="80"/>
       <w:r>
         <w:lastRenderedPageBreak/>
@@ -13678,7 +14122,15 @@
         </w:rPr>
       </w:pPr>
       <w:r>
-        <w:t>The model correctly identifies about two-thirds of employees who later left, with 43% of its flagged cases being true positives. Intervals are calculated using the Wilson score method, which is preferred over the normal approximation for these proportions</w:t>
+        <w:t xml:space="preserve">The model correctly identifies about two-thirds of employees who later left, with 43% of its flagged cases being true </w:t>
+      </w:r>
+      <w:proofErr w:type="gramStart"/>
+      <w:r>
+        <w:t>positives</w:t>
+      </w:r>
+      <w:proofErr w:type="gramEnd"/>
+      <w:r>
+        <w:t>. Intervals are calculated using the Wilson score method, which is preferred over the normal approximation for these proportions</w:t>
       </w:r>
       <w:r>
         <w:rPr>
@@ -13698,7 +14150,15 @@
         <w:t>follow directly from</w:t>
       </w:r>
       <w:r>
-        <w:t xml:space="preserve"> the nested design. Had performance been reported from a single 20% holdout, the same recall would be based on approximately 24 true positives out of 47, yielding a 95% interval of roughly [0.372, 0.647] — more than twice as wide and wide enough that the business case could not be meaningfully defended.</w:t>
+        <w:t xml:space="preserve"> the nested design. Had performance been reported from a single 20% holdout, the same recall would be based on approximately 24 true positives out of 47, yielding a 95% interval of roughly [0.372, </w:t>
+      </w:r>
+      <w:proofErr w:type="gramStart"/>
+      <w:r>
+        <w:t>0.647] —</w:t>
+      </w:r>
+      <w:proofErr w:type="gramEnd"/>
+      <w:r>
+        <w:t xml:space="preserve"> more than twice as wide and wide enough that the business case could not be meaningfully defended.</w:t>
       </w:r>
     </w:p>
     <w:p>
@@ -13706,7 +14166,7 @@
         <w:pStyle w:val="Heading2"/>
       </w:pPr>
       <w:bookmarkStart w:id="84" w:name="Xa77ae383efbc5b555164cc9f5d2b698bf3ba0c2"/>
-      <w:bookmarkStart w:id="85" w:name="_Toc240131145"/>
+      <w:bookmarkStart w:id="85" w:name="_Toc240133399"/>
       <w:bookmarkEnd w:id="82"/>
       <w:r>
         <w:t>Resolution against the registered success criteria</w:t>
@@ -14132,7 +14592,15 @@
               <w:jc w:val="left"/>
             </w:pPr>
             <w:r>
-              <w:t>Calibration usable for expected value</w:t>
+              <w:t xml:space="preserve">Calibration </w:t>
+            </w:r>
+            <w:proofErr w:type="gramStart"/>
+            <w:r>
+              <w:t>usable</w:t>
+            </w:r>
+            <w:proofErr w:type="gramEnd"/>
+            <w:r>
+              <w:t xml:space="preserve"> for expected value</w:t>
             </w:r>
           </w:p>
         </w:tc>
@@ -14350,7 +14818,15 @@
         <w:t xml:space="preserve">T1 has not been achieved, and the issue appears to be </w:t>
       </w:r>
       <w:r>
-        <w:t>target mis-specification rather than a model failure</w:t>
+        <w:t xml:space="preserve">target </w:t>
+      </w:r>
+      <w:proofErr w:type="gramStart"/>
+      <w:r>
+        <w:t>mis-specification</w:t>
+      </w:r>
+      <w:proofErr w:type="gramEnd"/>
+      <w:r>
+        <w:t xml:space="preserve"> rather than a model failure</w:t>
       </w:r>
       <w:r>
         <w:t xml:space="preserve">. </w:t>
@@ -14362,10 +14838,18 @@
         <w:t xml:space="preserve"> increasing recall was nearly free. However, it </w:t>
       </w:r>
       <w:r>
-        <w:t>is not</w:t>
-      </w:r>
-      <w:r>
-        <w:t>, because higher recall involves flagging more employees, each of which incurs a triage cost. The expected-value analysis indicates that the optimal recall is around 0.65, and the upper confidence bound of 0.708 does not meet the specified target. The correct approach is to understand that a technical success criterion should not be set prior to defining the cost function that supports it.</w:t>
+        <w:t xml:space="preserve">is </w:t>
+      </w:r>
+      <w:proofErr w:type="gramStart"/>
+      <w:r>
+        <w:t>not</w:t>
+      </w:r>
+      <w:r>
+        <w:t>,</w:t>
+      </w:r>
+      <w:proofErr w:type="gramEnd"/>
+      <w:r>
+        <w:t xml:space="preserve"> because higher recall involves flagging more employees, each of which incurs a triage cost. The expected-value analysis indicates that the optimal recall is around 0.65, and the upper confidence bound of 0.708 does not meet the specified target. The correct approach is to understand that a technical success criterion should not be set prior to defining the cost function that supports it.</w:t>
       </w:r>
     </w:p>
     <w:p>
@@ -14373,7 +14857,7 @@
         <w:pStyle w:val="Heading2"/>
       </w:pPr>
       <w:bookmarkStart w:id="86" w:name="threshold-selection"/>
-      <w:bookmarkStart w:id="87" w:name="_Toc240131146"/>
+      <w:bookmarkStart w:id="87" w:name="_Toc240133400"/>
       <w:bookmarkEnd w:id="84"/>
       <w:r>
         <w:t>Threshold selection</w:t>
@@ -15172,7 +15656,7 @@
         <w:pStyle w:val="Heading2"/>
       </w:pPr>
       <w:bookmarkStart w:id="88" w:name="Xe61b27eeb1fcf907987a73ccc10fc769dbf0356"/>
-      <w:bookmarkStart w:id="89" w:name="_Toc240131147"/>
+      <w:bookmarkStart w:id="89" w:name="_Toc240133401"/>
       <w:bookmarkEnd w:id="86"/>
       <w:r>
         <w:t>How the analytics opportunity is captured</w:t>
@@ -15198,7 +15682,7 @@
         <w:pStyle w:val="Heading1"/>
       </w:pPr>
       <w:bookmarkStart w:id="90" w:name="fairness-and-proxy-audit"/>
-      <w:bookmarkStart w:id="91" w:name="_Toc240131148"/>
+      <w:bookmarkStart w:id="91" w:name="_Toc240133402"/>
       <w:bookmarkEnd w:id="76"/>
       <w:bookmarkEnd w:id="88"/>
       <w:r>
@@ -15514,7 +15998,7 @@
       <w:pPr>
         <w:pStyle w:val="Heading1"/>
       </w:pPr>
-      <w:bookmarkStart w:id="93" w:name="_Toc240131149"/>
+      <w:bookmarkStart w:id="93" w:name="_Toc240133403"/>
       <w:r>
         <w:lastRenderedPageBreak/>
         <w:t>Evaluate Business Value: Cost Analysis</w:t>
@@ -15526,7 +16010,7 @@
         <w:pStyle w:val="Heading2"/>
       </w:pPr>
       <w:bookmarkStart w:id="94" w:name="capital-requirements"/>
-      <w:bookmarkStart w:id="95" w:name="_Toc240131150"/>
+      <w:bookmarkStart w:id="95" w:name="_Toc240133404"/>
       <w:r>
         <w:t>Capital Requirements</w:t>
       </w:r>
@@ -15913,7 +16397,7 @@
         <w:pStyle w:val="Heading2"/>
       </w:pPr>
       <w:bookmarkStart w:id="96" w:name="summary-of-cost-analysis"/>
-      <w:bookmarkStart w:id="97" w:name="_Toc240131151"/>
+      <w:bookmarkStart w:id="97" w:name="_Toc240133405"/>
       <w:bookmarkEnd w:id="94"/>
       <w:r>
         <w:t>Summary of Cost Analysis</w:t>
@@ -16492,7 +16976,23 @@
                 <w:b/>
                 <w:bCs/>
               </w:rPr>
-              <w:t>Ranges to ≈$6.8m at three years</w:t>
+              <w:t xml:space="preserve">Ranges to ≈$6.8m </w:t>
+            </w:r>
+            <w:proofErr w:type="gramStart"/>
+            <w:r>
+              <w:rPr>
+                <w:b/>
+                <w:bCs/>
+              </w:rPr>
+              <w:t>at</w:t>
+            </w:r>
+            <w:proofErr w:type="gramEnd"/>
+            <w:r>
+              <w:rPr>
+                <w:b/>
+                <w:bCs/>
+              </w:rPr>
+              <w:t xml:space="preserve"> three years</w:t>
             </w:r>
           </w:p>
         </w:tc>
@@ -16775,7 +17275,15 @@
         <w:pStyle w:val="BodyText"/>
       </w:pPr>
       <w:r>
-        <w:t>The 10% figure represents a triage budget: a spot retention bonus, a shift differential, an accelerated development allocation, and a stay conversation with tangible incentives. Its purpose is to retain an at-risk employee for one or two quarters while operations tackles the root causes using a separate budget line — which Helix maintains regardless of retention needs for capacity reasons.</w:t>
+        <w:t xml:space="preserve">The 10% figure represents a triage budget: a spot retention bonus, a shift differential, an accelerated development allocation, and a stay conversation with tangible incentives. Its purpose is to retain an at-risk employee for one or two quarters while operations </w:t>
+      </w:r>
+      <w:proofErr w:type="gramStart"/>
+      <w:r>
+        <w:t>tackles</w:t>
+      </w:r>
+      <w:proofErr w:type="gramEnd"/>
+      <w:r>
+        <w:t xml:space="preserve"> the root causes using a separate budget line — which Helix maintains regardless of retention needs for capacity reasons.</w:t>
       </w:r>
     </w:p>
     <w:p>
@@ -16838,7 +17346,7 @@
         <w:pStyle w:val="Heading2"/>
       </w:pPr>
       <w:bookmarkStart w:id="98" w:name="Xc844ba382df92a6eb390c7d02b185b63a4349ee"/>
-      <w:bookmarkStart w:id="99" w:name="_Toc240131152"/>
+      <w:bookmarkStart w:id="99" w:name="_Toc240133406"/>
       <w:bookmarkEnd w:id="96"/>
       <w:r>
         <w:t>The observation window: the dominant sensitivity</w:t>
@@ -17588,7 +18096,7 @@
         <w:pStyle w:val="Heading2"/>
       </w:pPr>
       <w:bookmarkStart w:id="100" w:name="Xea6821b2966d27ae84429c612ebc40e7bf29a79"/>
-      <w:bookmarkStart w:id="101" w:name="_Toc240131153"/>
+      <w:bookmarkStart w:id="101" w:name="_Toc240133407"/>
       <w:bookmarkEnd w:id="98"/>
       <w:r>
         <w:t>Recommended case, one-year window, threshold 0.60</w:t>
@@ -17989,7 +18497,15 @@
         <w:t>, the</w:t>
       </w:r>
       <w:r>
-        <w:t xml:space="preserve"> program still returns $1.7m because each of the 154 correctly identified leavers carries an ≈$86,000 liability, against an ≈$5,700 triage cost.</w:t>
+        <w:t xml:space="preserve"> program still returns $1.7m because each of the 154 correctly identified leavers carries an ≈$86,000 liability, against </w:t>
+      </w:r>
+      <w:proofErr w:type="gramStart"/>
+      <w:r>
+        <w:t>an</w:t>
+      </w:r>
+      <w:proofErr w:type="gramEnd"/>
+      <w:r>
+        <w:t xml:space="preserve"> ≈$5,700 triage cost.</w:t>
       </w:r>
     </w:p>
     <w:p>
@@ -17997,7 +18513,7 @@
         <w:pStyle w:val="Heading2"/>
       </w:pPr>
       <w:bookmarkStart w:id="102" w:name="roi-analysis"/>
-      <w:bookmarkStart w:id="103" w:name="_Toc240131154"/>
+      <w:bookmarkStart w:id="103" w:name="_Toc240133408"/>
       <w:bookmarkEnd w:id="100"/>
       <w:r>
         <w:t>ROI Analysis</w:t>
@@ -18626,7 +19142,7 @@
         <w:pStyle w:val="Heading2"/>
       </w:pPr>
       <w:bookmarkStart w:id="104" w:name="risk-reward-analysis"/>
-      <w:bookmarkStart w:id="105" w:name="_Toc240131155"/>
+      <w:bookmarkStart w:id="105" w:name="_Toc240133409"/>
       <w:bookmarkEnd w:id="102"/>
       <w:r>
         <w:t>Risk &amp; Reward Analysis</w:t>
@@ -19295,7 +19811,13 @@
               <w:jc w:val="left"/>
             </w:pPr>
             <w:r>
-              <w:t>Every projection void</w:t>
+              <w:t xml:space="preserve">Every projection </w:t>
+            </w:r>
+            <w:r>
+              <w:t xml:space="preserve">is </w:t>
+            </w:r>
+            <w:r>
+              <w:t>void</w:t>
             </w:r>
             <w:r>
               <w:t>.</w:t>
@@ -19590,7 +20112,15 @@
         <w:t>Reward asymmetry:</w:t>
       </w:r>
       <w:r>
-        <w:t xml:space="preserve"> the maximum downside is limited to about $2.2 million in Year 1, with a more probable worst case of $0.2 million within one year. The upside is recurring: since the $145,000 implementation fee is a one-time expense, the Year-2 returns increase as this cost is no longer incurred.</w:t>
+        <w:t xml:space="preserve"> the maximum downside is limited to about $2.2 million in Year 1, with a more probable worst case of $0.2 million within one year. The upside is </w:t>
+      </w:r>
+      <w:proofErr w:type="gramStart"/>
+      <w:r>
+        <w:t>recurring:</w:t>
+      </w:r>
+      <w:proofErr w:type="gramEnd"/>
+      <w:r>
+        <w:t xml:space="preserve"> since the $145,000 implementation fee is a one-time expense, the Year-2 returns increase as this cost is no longer incurred.</w:t>
       </w:r>
     </w:p>
     <w:p>
@@ -19615,7 +20145,7 @@
       <w:pPr>
         <w:pStyle w:val="Heading1"/>
       </w:pPr>
-      <w:bookmarkStart w:id="107" w:name="_Toc240131156"/>
+      <w:bookmarkStart w:id="107" w:name="_Toc240133410"/>
       <w:r>
         <w:lastRenderedPageBreak/>
         <w:t>Methodological Limitations and Assumptions</w:t>
@@ -19738,7 +20268,13 @@
         <w:t xml:space="preserve">4. The financial case relies heavily on assumptions rather than the model itself. </w:t>
       </w:r>
       <w:r>
-        <w:t>This is a critical but often overlooked limitation for executives. When considering the full plausible range of A8, the projected return varies from 18% to 136%, and in the observation window, it ranges from +77% to −41%. The classifier’s impact on this variance is relatively minor. The model functions as a targeting filter—it doesn't reduce costs but provides lead time. The value of that lead time depends solely on operational effectiveness, which Helix has yet to measure.</w:t>
+        <w:t xml:space="preserve">This is a critical but often overlooked limitation for executives. When considering the full plausible range of A8, the projected return varies from 18% to 136%, and in the observation window, it ranges from +77% to −41%. The classifier’s impact on this variance is relatively minor. The model functions as a targeting filter—it </w:t>
+      </w:r>
+      <w:r>
+        <w:t>does not</w:t>
+      </w:r>
+      <w:r>
+        <w:t xml:space="preserve"> reduce costs but provides lead time. The value of that lead time depends solely on operational effectiveness, which Helix has yet to measure.</w:t>
       </w:r>
     </w:p>
     <w:p>
@@ -19746,7 +20282,15 @@
         <w:pStyle w:val="BodyText"/>
       </w:pPr>
       <w:r>
-        <w:t xml:space="preserve">This principle is similar to condition-based maintenance: an anomaly detection algorithm on a compressor does not prevent failure or save money. Instead, it creates an opportunity to intervene. Savings occur only if the intervention prevents failure, with economics depending on the cost of action versus </w:t>
+        <w:t xml:space="preserve">This principle is </w:t>
+      </w:r>
+      <w:proofErr w:type="gramStart"/>
+      <w:r>
+        <w:t>similar to</w:t>
+      </w:r>
+      <w:proofErr w:type="gramEnd"/>
+      <w:r>
+        <w:t xml:space="preserve"> condition-based maintenance: an anomaly detection algorithm on a compressor does not prevent failure or save money. Instead, it creates an opportunity to intervene. Savings occur only if the intervention prevents failure, with economics depending on the cost of action versus </w:t>
       </w:r>
       <w:r>
         <w:t xml:space="preserve">the cost of </w:t>
@@ -19863,7 +20407,15 @@
         <w:t>Success criterion T1 was incorrectly specified.</w:t>
       </w:r>
       <w:r>
-        <w:t xml:space="preserve"> The 0.75 recall target was set before analyzing the cost function, assuming recall was almost free. However, it is not. This serves as a process lesson: avoid fixing a technical criterion before understanding the economics that support it.</w:t>
+        <w:t xml:space="preserve"> The 0.75 recall target was set before analyzing the cost function, assuming recall was almost free. However, it is not. This serves as a process lesson: avoid fixing a technical criterion before understanding the economics that </w:t>
+      </w:r>
+      <w:proofErr w:type="gramStart"/>
+      <w:r>
+        <w:t>support</w:t>
+      </w:r>
+      <w:proofErr w:type="gramEnd"/>
+      <w:r>
+        <w:t xml:space="preserve"> it.</w:t>
       </w:r>
     </w:p>
     <w:p>
@@ -19915,7 +20467,7 @@
       <w:pPr>
         <w:pStyle w:val="Heading1"/>
       </w:pPr>
-      <w:bookmarkStart w:id="109" w:name="_Toc240131157"/>
+      <w:bookmarkStart w:id="109" w:name="_Toc240133411"/>
       <w:r>
         <w:lastRenderedPageBreak/>
         <w:t>Scale up the POC: Recommendations</w:t>
@@ -19927,7 +20479,7 @@
         <w:pStyle w:val="Heading2"/>
       </w:pPr>
       <w:bookmarkStart w:id="110" w:name="alternative-options-considered"/>
-      <w:bookmarkStart w:id="111" w:name="_Toc240131158"/>
+      <w:bookmarkStart w:id="111" w:name="_Toc240133412"/>
       <w:r>
         <w:t>Alternative options considered</w:t>
       </w:r>
@@ -19938,7 +20490,25 @@
         <w:pStyle w:val="FirstParagraph"/>
       </w:pPr>
       <w:r>
-        <w:t>Doing nothing keeps the current liability level but is rejected. A dashboard that only provides descriptive statistics, highlighting EDA findings without scoring individuals, is more affordable and has no ethical risks. However, it offers no lead time at the employee level. We keep this as a fallback if governance review prevents individual scoring. We recommend and detail predictive scoring with human oversight, ensuring stakeholder concerns are managed.</w:t>
+        <w:t xml:space="preserve">Doing nothing </w:t>
+      </w:r>
+      <w:r>
+        <w:t>maintains the current liability level but is not an option</w:t>
+      </w:r>
+      <w:r>
+        <w:t xml:space="preserve">. A dashboard that </w:t>
+      </w:r>
+      <w:r>
+        <w:t>provides only descriptive statistics, highlighting EDA findings without scoring individuals, is more affordable and carries</w:t>
+      </w:r>
+      <w:r>
+        <w:t xml:space="preserve"> no ethical risks. However, it offers no lead time at the employee level. We keep this as a fallback if governance review prevents individual scoring. We recommend and detail predictive scoring with human oversight</w:t>
+      </w:r>
+      <w:r>
+        <w:t xml:space="preserve"> to ensure</w:t>
+      </w:r>
+      <w:r>
+        <w:t xml:space="preserve"> stakeholder concerns are managed.</w:t>
       </w:r>
     </w:p>
     <w:p>
@@ -19946,7 +20516,7 @@
         <w:pStyle w:val="Heading2"/>
       </w:pPr>
       <w:bookmarkStart w:id="112" w:name="deployment-roadmap"/>
-      <w:bookmarkStart w:id="113" w:name="_Toc240131159"/>
+      <w:bookmarkStart w:id="113" w:name="_Toc240133413"/>
       <w:bookmarkEnd w:id="110"/>
       <w:r>
         <w:t>Deployment roadmap</w:t>
@@ -20029,7 +20599,21 @@
         <w:t>Phase 2 — Controlled pilot (Months 4–6):</w:t>
       </w:r>
       <w:r>
-        <w:t xml:space="preserve"> Deploy the project to Research &amp; Development, focusing on the largest group with the highest business stakes. Conduct a randomized control trial: for employees identified as high-risk, randomly select some to receive intervention while others follow the standard process. This approach allows for empirical measurement of A8 instead of assuming it, turning one of the engagement’s weakest assumptions into an observable parameter. Train business partners to interpret attribution results and lead discussions based on them. Progress only if the measured effectiveness surpasses the 16.9% break-even point.</w:t>
+        <w:t xml:space="preserve"> Deploy the project to Research &amp; Development, focusing on the largest group with the highest business stakes. Conduct a randomized </w:t>
+      </w:r>
+      <w:r>
+        <w:t>controlled</w:t>
+      </w:r>
+      <w:r>
+        <w:t xml:space="preserve"> trial: for employees identified as high-risk, randomly select some to receive intervention while others follow the standard process. This approach allows for empirical measurement of A8 instead of assuming it, turning one of the engagement’s weakest assumptions into an observable parameter. Train business partners to interpret attribution results and lead discussions based on them. Progress </w:t>
+      </w:r>
+      <w:proofErr w:type="gramStart"/>
+      <w:r>
+        <w:t>only</w:t>
+      </w:r>
+      <w:proofErr w:type="gramEnd"/>
+      <w:r>
+        <w:t xml:space="preserve"> if the measured effectiveness surpasses the 16.9% break-even point.</w:t>
       </w:r>
     </w:p>
     <w:p>
@@ -20074,7 +20658,7 @@
         <w:pStyle w:val="Heading2"/>
       </w:pPr>
       <w:bookmarkStart w:id="114" w:name="what-scalable-means-here"/>
-      <w:bookmarkStart w:id="115" w:name="_Toc240131160"/>
+      <w:bookmarkStart w:id="115" w:name="_Toc240133414"/>
       <w:bookmarkEnd w:id="112"/>
       <w:r>
         <w:t>Defining Scalable in Context</w:t>
@@ -20095,7 +20679,13 @@
         <w:t>computational issue</w:t>
       </w:r>
       <w:r>
-        <w:t>. Using logistic regression to score 1,470 employees is almost instantaneous and could extend to 100,000 employees without needing any changes in architecture. The real limiting factors are organizational.</w:t>
+        <w:t xml:space="preserve">. Using logistic regression to score 1,470 employees is almost instantaneous and could extend to 100,000 employees without </w:t>
+      </w:r>
+      <w:r>
+        <w:t>any architectural changes</w:t>
+      </w:r>
+      <w:r>
+        <w:t>. The real limiting factors are organizational.</w:t>
       </w:r>
     </w:p>
     <w:p>
@@ -20103,7 +20693,19 @@
         <w:pStyle w:val="BodyText"/>
       </w:pPr>
       <w:r>
-        <w:t>Scalable indicates that the pipeline operates automatically on scheduled HRIS data, eliminating manual effort. Retraining follows a documented, version-controlled process that any skilled analyst can perform, rather than relying on tacit knowledge from a single consultant. The volume of flags remains manageable within business-partner capacity—at a threshold of 0.60, approximately 359 flags across 1,470 employees equate to roughly six discussions per partner each month. The governance framework withstands audit scrutiny, and the intervention options are clearly defined and costed, avoiding improvisation.</w:t>
+        <w:t xml:space="preserve">Scalable </w:t>
+      </w:r>
+      <w:r>
+        <w:t>means the pipeline runs</w:t>
+      </w:r>
+      <w:r>
+        <w:t xml:space="preserve"> automatically on scheduled HRIS data, eliminating manual effort. Retraining follows a documented, version-controlled process that any skilled analyst can perform, rather than relying on </w:t>
+      </w:r>
+      <w:r>
+        <w:t>a single consultant's tacit knowledge</w:t>
+      </w:r>
+      <w:r>
+        <w:t>. The volume of flags remains manageable within business-partner capacity—at a threshold of 0.60, approximately 359 flags across 1,470 employees equate to roughly six discussions per partner each month. The governance framework withstands audit scrutiny, and the intervention options are clearly defined and costed, avoiding improvisation.</w:t>
       </w:r>
     </w:p>
     <w:p>
@@ -20111,7 +20713,15 @@
         <w:pStyle w:val="BodyText"/>
       </w:pPr>
       <w:r>
-        <w:t>Challenges to anticipate include: Capacity ceiling — flag volume increases linearly with headcount, but partner capacity does not, requiring recalibration of thresholds as a capacity constraint rather than purely economic. Feedback contamination — after interventions, training labels become endogenous, as employees who stay due to an intervention are recorded as non-leavers, leading to bias and under-prediction of risk in intervened groups; a rolling control-group design is necessary. Manager gaming — if scores impact managerial evaluations, inputs may be managed rather than honestly reported. Concept drift — shifting labor-market conditions mean a model trained on current data will become less accurate over time.</w:t>
+        <w:t xml:space="preserve">Challenges to anticipate </w:t>
+      </w:r>
+      <w:proofErr w:type="gramStart"/>
+      <w:r>
+        <w:t>include:</w:t>
+      </w:r>
+      <w:proofErr w:type="gramEnd"/>
+      <w:r>
+        <w:t xml:space="preserve"> Capacity ceiling — flag volume increases linearly with headcount, but partner capacity does not, requiring recalibration of thresholds as a capacity constraint rather than purely economic. Feedback contamination — after interventions, training labels become endogenous, as employees who stay due to an intervention are recorded as non-leavers, leading to bias and under-prediction of risk in intervened groups; a rolling control-group design is necessary. Manager gaming — if scores impact managerial evaluations, inputs may be managed rather than honestly reported. Concept drift — shifting labor-market conditions mean a model trained on current data will become less accurate over time.</w:t>
       </w:r>
     </w:p>
     <w:p>
@@ -20119,7 +20729,7 @@
         <w:pStyle w:val="Heading2"/>
       </w:pPr>
       <w:bookmarkStart w:id="116" w:name="model-retraining-and-monitoring-schedule"/>
-      <w:bookmarkStart w:id="117" w:name="_Toc240131161"/>
+      <w:bookmarkStart w:id="117" w:name="_Toc240133415"/>
       <w:bookmarkEnd w:id="114"/>
       <w:r>
         <w:t>Model retraining and monitoring schedule</w:t>
@@ -20231,7 +20841,15 @@
               <w:pStyle w:val="Compact"/>
             </w:pPr>
             <w:r>
-              <w:t>Flag deviations in volume exceeding 20% compared to the previous month.</w:t>
+              <w:t xml:space="preserve">Flag deviations in volume </w:t>
+            </w:r>
+            <w:proofErr w:type="gramStart"/>
+            <w:r>
+              <w:t>exceeding</w:t>
+            </w:r>
+            <w:proofErr w:type="gramEnd"/>
+            <w:r>
+              <w:t xml:space="preserve"> 20% compared to the previous month.</w:t>
             </w:r>
           </w:p>
         </w:tc>
@@ -20263,7 +20881,15 @@
               <w:pStyle w:val="Compact"/>
             </w:pPr>
             <w:r>
-              <w:t>Perform a complete retraining using the last 24 months, then re-validate, re-run threshold selection based on current cost parameters, and conduct fairness testing again.</w:t>
+              <w:t xml:space="preserve">Perform </w:t>
+            </w:r>
+            <w:proofErr w:type="gramStart"/>
+            <w:r>
+              <w:t>a complete</w:t>
+            </w:r>
+            <w:proofErr w:type="gramEnd"/>
+            <w:r>
+              <w:t xml:space="preserve"> retraining using the last 24 months, then re-validate, re-run threshold selection based on current cost parameters, and conduct fairness testing again.</w:t>
             </w:r>
           </w:p>
         </w:tc>
@@ -20444,8 +21070,13 @@
       <w:pPr>
         <w:pStyle w:val="BodyText"/>
       </w:pPr>
-      <w:r>
-        <w:t xml:space="preserve">Quarterly retraining is chosen deliberately. Monthly retraining on this volume of positive cases would fit noise; annual retraining would leave the model stale through the </w:t>
+      <w:proofErr w:type="gramStart"/>
+      <w:r>
+        <w:t>Quarterly</w:t>
+      </w:r>
+      <w:proofErr w:type="gramEnd"/>
+      <w:r>
+        <w:t xml:space="preserve"> retraining is chosen deliberately. Monthly retraining on this volume of positive cases would fit noise; annual retraining would leave the model stale through the </w:t>
       </w:r>
       <w:r>
         <w:t>labor-market</w:t>
@@ -20459,7 +21090,7 @@
         <w:pStyle w:val="Heading2"/>
       </w:pPr>
       <w:bookmarkStart w:id="118" w:name="ethical-ai-governance-provisions"/>
-      <w:bookmarkStart w:id="119" w:name="_Toc240131162"/>
+      <w:bookmarkStart w:id="119" w:name="_Toc240133416"/>
       <w:bookmarkEnd w:id="116"/>
       <w:r>
         <w:t>Ethical AI governance provisions</w:t>
@@ -20493,7 +21124,21 @@
         <w:t xml:space="preserve">Human-in-the-loop decision-making </w:t>
       </w:r>
       <w:r>
-        <w:t>involves the model generating a ranked list and attribution, but not making decisions. No action impacting any employee can be taken based on a model score without documented human review by an authorized business partner who has the obligation to override if necessary. The system is intentionally designed without autonomous action capability.</w:t>
+        <w:t xml:space="preserve">involves the model generating a ranked list and </w:t>
+      </w:r>
+      <w:proofErr w:type="gramStart"/>
+      <w:r>
+        <w:t>attribution, but</w:t>
+      </w:r>
+      <w:proofErr w:type="gramEnd"/>
+      <w:r>
+        <w:t xml:space="preserve"> not making decisions. No action impacting any employee can be taken based on a model score without documented human review by an authorized business partner</w:t>
+      </w:r>
+      <w:r>
+        <w:t>, who must</w:t>
+      </w:r>
+      <w:r>
+        <w:t xml:space="preserve"> override if necessary. The system is intentionally designed without autonomous action capability.</w:t>
       </w:r>
     </w:p>
     <w:p>
@@ -20504,7 +21149,13 @@
         <w:t xml:space="preserve">2. </w:t>
       </w:r>
       <w:r>
-        <w:t>Use of propensity scores in promotion, performance evaluations, compensation decisions, redundancy, or project distribution is strictly forbidden. We will enforce this rule technically with access controls and regularly audit to maintain trust and ethical standards.</w:t>
+        <w:t xml:space="preserve">Use of propensity scores in promotion, performance evaluations, compensation decisions, redundancy, or project distribution is strictly forbidden. We will enforce this rule technically </w:t>
+      </w:r>
+      <w:r>
+        <w:t>through access controls and regular audits</w:t>
+      </w:r>
+      <w:r>
+        <w:t xml:space="preserve"> to maintain trust and ethical standards.</w:t>
       </w:r>
     </w:p>
     <w:p>
@@ -20574,25 +21225,38 @@
       <w:r>
         <w:t xml:space="preserve">. </w:t>
       </w:r>
-      <w:proofErr w:type="spellStart"/>
       <w:r>
         <w:rPr>
           <w:rFonts w:ascii="Consolas" w:hAnsi="Consolas"/>
           <w:sz w:val="22"/>
           <w:szCs w:val="22"/>
         </w:rPr>
-        <w:t>DistanceFromHome</w:t>
-      </w:r>
-      <w:proofErr w:type="spellEnd"/>
-      <w:r>
-        <w:rPr>
+        <w:t xml:space="preserve">We also exclude </w:t>
+      </w:r>
+      <w:proofErr w:type="spellStart"/>
+      <w:r>
+        <w:rPr>
+          <w:rFonts w:ascii="Consolas" w:hAnsi="Consolas"/>
           <w:sz w:val="22"/>
           <w:szCs w:val="22"/>
         </w:rPr>
-        <w:t xml:space="preserve"> </w:t>
-      </w:r>
-      <w:r>
-        <w:t>is also excluded as an untestable proxy. Since exclusion alone doesn't ensure neutrality, we conduct quarterly testing for disparate impact on actual predictions across all accessible protected classes. The results are reported to the governance forum, and any feature that doesn't pass the test is removed.</w:t>
+        <w:t>DistanceFromHome</w:t>
+      </w:r>
+      <w:proofErr w:type="spellEnd"/>
+      <w:r>
+        <w:t xml:space="preserve"> as an untestable proxy. Since exclusion alone </w:t>
+      </w:r>
+      <w:r>
+        <w:t>does not</w:t>
+      </w:r>
+      <w:r>
+        <w:t xml:space="preserve"> ensure neutrality, we conduct quarterly testing for disparate impact on actual predictions across all accessible protected classes. </w:t>
+      </w:r>
+      <w:r>
+        <w:t>We report the results to the governance forum and remove any feature that fails the test</w:t>
+      </w:r>
+      <w:r>
+        <w:t>.</w:t>
       </w:r>
     </w:p>
     <w:p>
@@ -20614,7 +21278,13 @@
         <w:t>No secondary use without prior review.</w:t>
       </w:r>
       <w:r>
-        <w:t xml:space="preserve"> The pipeline cannot be expanded to new use cases, populations, or data sources without re-approval through governance. Scope creep leads to the deterioration of ethical integrity in systems.</w:t>
+        <w:t xml:space="preserve"> The pipeline cannot be expanded to new use cases, populations, or data sources without re-approval through governance. Scope creep </w:t>
+      </w:r>
+      <w:r>
+        <w:t>can erode</w:t>
+      </w:r>
+      <w:r>
+        <w:t xml:space="preserve"> ethical integrity in systems.</w:t>
       </w:r>
     </w:p>
     <w:p>
@@ -20636,7 +21306,13 @@
         <w:t xml:space="preserve">Right to challenge. </w:t>
       </w:r>
       <w:r>
-        <w:t>Any employee who is part of a retention conversation triggered by the model can request a review by an HR representative independent of the model; their decision is final and will be recorded.</w:t>
+        <w:t xml:space="preserve">Any employee </w:t>
+      </w:r>
+      <w:r>
+        <w:t>in</w:t>
+      </w:r>
+      <w:r>
+        <w:t xml:space="preserve"> a retention conversation triggered by the model can request a review by an HR representative independent of the model; their decision is final and will be recorded.</w:t>
       </w:r>
     </w:p>
     <w:p>
@@ -20656,7 +21332,7 @@
         <w:pStyle w:val="Heading2"/>
       </w:pPr>
       <w:bookmarkStart w:id="120" w:name="concluding-recommendation"/>
-      <w:bookmarkStart w:id="121" w:name="_Toc240131163"/>
+      <w:bookmarkStart w:id="121" w:name="_Toc240133417"/>
       <w:bookmarkEnd w:id="118"/>
       <w:r>
         <w:t>Concluding recommendation</w:t>
@@ -20668,7 +21344,19 @@
         <w:pStyle w:val="BodyText"/>
       </w:pPr>
       <w:r>
-        <w:t xml:space="preserve">Helix should allocate approximately $185,000 for Phase 1 implementation and validation, withholding the retention intervention budget until approvals are secured for both Phase 1 and Phase 2 gates. The proof of concept confirms three key points: the analytical architecture is effective—tested on 1,470 employees, the model predicts 65% of future departures with 43% precision, excluding protected attributes and the main proxy, achieving an AUC of 0.813; the decision framework is robust, with a break-even intervention effectiveness of 16.9%, well below published benchmarks, and the program remains financially beneficial across the full confidence range of model performance and intervention success. Additionally, the economics are conditional: over a one-year period, the program generates about $1.7 million at a 77% ROI, but it does not pay out over two years. </w:t>
+        <w:t>Helix should allocate approximately $185,000 for Phase 1 implementation and validation, withholding the retention intervention budget until approvals are secured for both Phase 1 and Phase 2 gates. The proof of concept confirms three key points: the analytical architecture is effective—tested on 1,470 employees, the model predicts 65% of future departures with 43% precision, excluding protected attributes and the main proxy, achieving an AUC of 0.813; the decision framework is robust, with a break-even intervention effectiveness of 16.9%, well below published benchmarks</w:t>
+      </w:r>
+      <w:r>
+        <w:t>;</w:t>
+      </w:r>
+      <w:r>
+        <w:t xml:space="preserve"> and the program remains financially beneficial across the full confidence range of model performance and intervention success. Additionally, the economics are conditional: over </w:t>
+      </w:r>
+      <w:r>
+        <w:t>one year</w:t>
+      </w:r>
+      <w:r>
+        <w:t xml:space="preserve">, the program generates about $1.7 million at a 77% ROI, but it does not pay out over two years. </w:t>
       </w:r>
     </w:p>
     <w:p>
@@ -20676,7 +21364,15 @@
         <w:pStyle w:val="BodyText"/>
       </w:pPr>
       <w:r>
-        <w:t xml:space="preserve">However, the proof of concept does not confirm the intervention’s effectiveness. The classifier functions as a sensor, providing lead time but not retaining employees on its own. The program’s success hinges on the effectiveness of HR actions, which Helix has yet to measure. The most important next step is not developing a better model but conducting a controlled pilot to test whether targeted interventions influence employee decisions. </w:t>
+        <w:t xml:space="preserve">However, the proof of concept does not confirm the intervention’s effectiveness. The classifier functions as a sensor, providing lead time but not retaining employees on </w:t>
+      </w:r>
+      <w:proofErr w:type="gramStart"/>
+      <w:r>
+        <w:t>its</w:t>
+      </w:r>
+      <w:proofErr w:type="gramEnd"/>
+      <w:r>
+        <w:t xml:space="preserve"> own. The program’s success hinges on the effectiveness of HR actions, which Helix has yet to measure. The most important next step is not developing a better model but conducting a controlled pilot to test whether targeted interventions influence employee decisions. </w:t>
       </w:r>
     </w:p>
     <w:p>
@@ -20715,7 +21411,7 @@
       <w:pPr>
         <w:pStyle w:val="Heading1"/>
       </w:pPr>
-      <w:bookmarkStart w:id="123" w:name="_Toc240131164"/>
+      <w:bookmarkStart w:id="123" w:name="_Toc240133418"/>
       <w:r>
         <w:lastRenderedPageBreak/>
         <w:t>References</w:t>
@@ -20799,7 +21495,23 @@
           <w:sz w:val="22"/>
           <w:szCs w:val="22"/>
         </w:rPr>
-        <w:t xml:space="preserve">Chartered Institute of Personnel and Development. n.d. </w:t>
+        <w:t xml:space="preserve">Chartered Institute of Personnel and Development. </w:t>
+      </w:r>
+      <w:proofErr w:type="gramStart"/>
+      <w:r>
+        <w:rPr>
+          <w:sz w:val="22"/>
+          <w:szCs w:val="22"/>
+        </w:rPr>
+        <w:t>n.d</w:t>
+      </w:r>
+      <w:proofErr w:type="gramEnd"/>
+      <w:r>
+        <w:rPr>
+          <w:sz w:val="22"/>
+          <w:szCs w:val="22"/>
+        </w:rPr>
+        <w:t xml:space="preserve">. </w:t>
       </w:r>
       <w:r>
         <w:rPr>
@@ -21087,7 +21799,23 @@
           <w:sz w:val="22"/>
           <w:szCs w:val="22"/>
         </w:rPr>
-        <w:t xml:space="preserve">Waskom, Michael L. 2021. “seaborn: Statistical Data Visualization.” </w:t>
+        <w:t>Waskom, Michael L. 2021. “</w:t>
+      </w:r>
+      <w:proofErr w:type="gramStart"/>
+      <w:r>
+        <w:rPr>
+          <w:sz w:val="22"/>
+          <w:szCs w:val="22"/>
+        </w:rPr>
+        <w:t>seaborn</w:t>
+      </w:r>
+      <w:proofErr w:type="gramEnd"/>
+      <w:r>
+        <w:rPr>
+          <w:sz w:val="22"/>
+          <w:szCs w:val="22"/>
+        </w:rPr>
+        <w:t xml:space="preserve">: Statistical Data Visualization.” </w:t>
       </w:r>
       <w:r>
         <w:rPr>
@@ -21096,7 +21824,27 @@
           <w:sz w:val="22"/>
           <w:szCs w:val="22"/>
         </w:rPr>
-        <w:t>Journal of Open Source Software</w:t>
+        <w:t xml:space="preserve">Journal of </w:t>
+      </w:r>
+      <w:proofErr w:type="gramStart"/>
+      <w:r>
+        <w:rPr>
+          <w:i/>
+          <w:iCs/>
+          <w:sz w:val="22"/>
+          <w:szCs w:val="22"/>
+        </w:rPr>
+        <w:t>Open Source</w:t>
+      </w:r>
+      <w:proofErr w:type="gramEnd"/>
+      <w:r>
+        <w:rPr>
+          <w:i/>
+          <w:iCs/>
+          <w:sz w:val="22"/>
+          <w:szCs w:val="22"/>
+        </w:rPr>
+        <w:t xml:space="preserve"> Software</w:t>
       </w:r>
       <w:r>
         <w:rPr>
@@ -21153,7 +21901,7 @@
       <w:pPr>
         <w:pStyle w:val="Heading1"/>
       </w:pPr>
-      <w:bookmarkStart w:id="124" w:name="_Toc240131165"/>
+      <w:bookmarkStart w:id="124" w:name="_Toc240133419"/>
       <w:r>
         <w:lastRenderedPageBreak/>
         <w:t>Appendix</w:t>
@@ -21166,7 +21914,7 @@
       </w:pPr>
       <w:bookmarkStart w:id="125" w:name="appendix-a-code-repository"/>
       <w:bookmarkStart w:id="126" w:name="appendix"/>
-      <w:bookmarkStart w:id="127" w:name="_Toc240131166"/>
+      <w:bookmarkStart w:id="127" w:name="_Toc240133420"/>
       <w:bookmarkEnd w:id="122"/>
       <w:r>
         <w:t>Appendix A — Code repository</w:t>
@@ -21192,19 +21940,7 @@
           <w:rPr>
             <w:rStyle w:val="Hyperlink"/>
           </w:rPr>
-          <w:t>Helix Retentio</w:t>
-        </w:r>
-        <w:r>
-          <w:rPr>
-            <w:rStyle w:val="Hyperlink"/>
-          </w:rPr>
-          <w:t>n</w:t>
-        </w:r>
-        <w:r>
-          <w:rPr>
-            <w:rStyle w:val="Hyperlink"/>
-          </w:rPr>
-          <w:t xml:space="preserve"> Predictor</w:t>
+          <w:t>Helix Retention Predictor</w:t>
         </w:r>
       </w:hyperlink>
     </w:p>
@@ -21213,7 +21949,7 @@
         <w:pStyle w:val="Heading2"/>
       </w:pPr>
       <w:bookmarkStart w:id="128" w:name="appendix-b-interactive-visualisations"/>
-      <w:bookmarkStart w:id="129" w:name="_Toc240131167"/>
+      <w:bookmarkStart w:id="129" w:name="_Toc240133421"/>
       <w:bookmarkEnd w:id="125"/>
       <w:r>
         <w:t xml:space="preserve">Appendix B — Interactive </w:t>
@@ -21264,7 +22000,7 @@
         <w:t xml:space="preserve">Risk exposure by department (measured in </w:t>
       </w:r>
       <w:r>
-        <w:t>million</w:t>
+        <w:t>millions of</w:t>
       </w:r>
       <w:r>
         <w:t xml:space="preserve"> USD), propensity distribution</w:t>
@@ -21287,7 +22023,7 @@
         <w:pStyle w:val="Heading2"/>
       </w:pPr>
       <w:bookmarkStart w:id="130" w:name="appendix-c-deliverable-manifest"/>
-      <w:bookmarkStart w:id="131" w:name="_Toc240131168"/>
+      <w:bookmarkStart w:id="131" w:name="_Toc240133422"/>
       <w:bookmarkEnd w:id="128"/>
       <w:r>
         <w:t>Appendix C — Deliverable manifest</w:t>
@@ -21621,7 +22357,7 @@
         <w:pStyle w:val="Heading2"/>
       </w:pPr>
       <w:bookmarkStart w:id="132" w:name="appendix-d-dataset-schema"/>
-      <w:bookmarkStart w:id="133" w:name="_Toc240131169"/>
+      <w:bookmarkStart w:id="133" w:name="_Toc240133423"/>
       <w:bookmarkEnd w:id="130"/>
       <w:r>
         <w:t>Appendix D — Dataset schema</w:t>
@@ -23285,8 +24021,13 @@
             <w:pPr>
               <w:pStyle w:val="Compact"/>
             </w:pPr>
-            <w:r>
-              <w:t>constant [‘Y’]</w:t>
+            <w:proofErr w:type="gramStart"/>
+            <w:r>
+              <w:t>constant [‘</w:t>
+            </w:r>
+            <w:proofErr w:type="gramEnd"/>
+            <w:r>
+              <w:t>Y’]</w:t>
             </w:r>
           </w:p>
         </w:tc>
@@ -24244,7 +24985,7 @@
         <w:pStyle w:val="Heading2"/>
       </w:pPr>
       <w:bookmarkStart w:id="134" w:name="appendix-e-model-coefficients"/>
-      <w:bookmarkStart w:id="135" w:name="_Toc240131170"/>
+      <w:bookmarkStart w:id="135" w:name="_Toc240133424"/>
       <w:bookmarkEnd w:id="132"/>
       <w:r>
         <w:t>Appendix E — Model coefficients</w:t>
@@ -24447,7 +25188,7 @@
         <w:pStyle w:val="Heading2"/>
       </w:pPr>
       <w:bookmarkStart w:id="136" w:name="appendix-f-full-threshold-sweep"/>
-      <w:bookmarkStart w:id="137" w:name="_Toc240131171"/>
+      <w:bookmarkStart w:id="137" w:name="_Toc240133425"/>
       <w:bookmarkEnd w:id="134"/>
       <w:r>
         <w:t>Appendix F — Full threshold sweep</w:t>
@@ -25959,8 +26700,506 @@
         <w:pStyle w:val="BodyText"/>
       </w:pPr>
       <w:r>
-        <w:t>The net value reaches a peak of 0.60 and remains relatively stable between 0.50 and 0.70. Consequently, the operating point is supported primarily by criteria such as precision, capacity, and threshold stability, rather than dollar amount alone. The percentage ROI steadily increases with the threshold because the intervention base decreases; therefore, Helix should focus on maximizing absolute value within this plateau, instead of just optimizing for return efficiency on a reduced budget.</w:t>
-      </w:r>
+        <w:t xml:space="preserve">The net value </w:t>
+      </w:r>
+      <w:r>
+        <w:t>peaks at</w:t>
+      </w:r>
+      <w:r>
+        <w:t xml:space="preserve"> 0.60 and remains relatively stable between 0.50 and 0.70. </w:t>
+      </w:r>
+      <w:r>
+        <w:t xml:space="preserve">Consequently, the operating point is supported primarily by criteria such as precision, capacity, and threshold stability, rather than dollar amount alone. The percentage ROI steadily increases with the threshold because the intervention base decreases; therefore, Helix should focus on maximizing absolute value within this plateau, </w:t>
+      </w:r>
+      <w:r>
+        <w:t xml:space="preserve">rather than optimizing </w:t>
+      </w:r>
+      <w:r>
+        <w:t>return efficiency</w:t>
+      </w:r>
+      <w:r>
+        <w:t xml:space="preserve"> on a reduced budget.</w:t>
+      </w:r>
+    </w:p>
+    <w:p>
+      <w:pPr>
+        <w:jc w:val="left"/>
+      </w:pPr>
+      <w:r>
+        <w:br w:type="page"/>
+      </w:r>
+    </w:p>
+    <w:p>
+      <w:pPr>
+        <w:pStyle w:val="Heading2"/>
+      </w:pPr>
+      <w:bookmarkStart w:id="138" w:name="_Toc240133426"/>
+      <w:r>
+        <w:lastRenderedPageBreak/>
+        <w:t xml:space="preserve">Appendix </w:t>
+      </w:r>
+      <w:r>
+        <w:t>G</w:t>
+      </w:r>
+      <w:r>
+        <w:t xml:space="preserve"> — </w:t>
+      </w:r>
+      <w:r>
+        <w:t>Individual Reflective Statement</w:t>
+      </w:r>
+      <w:bookmarkEnd w:id="138"/>
+    </w:p>
+    <w:p>
+      <w:pPr>
+        <w:pStyle w:val="BodyText"/>
+        <w:rPr>
+          <w:b/>
+          <w:bCs/>
+          <w:lang w:val="en-ZA"/>
+        </w:rPr>
+      </w:pPr>
+      <w:r>
+        <w:rPr>
+          <w:b/>
+          <w:bCs/>
+          <w:lang w:val="en-ZA"/>
+        </w:rPr>
+        <w:t>Individual contribution</w:t>
+      </w:r>
+    </w:p>
+    <w:p>
+      <w:pPr>
+        <w:pStyle w:val="BodyText"/>
+        <w:rPr>
+          <w:lang w:val="en-ZA"/>
+        </w:rPr>
+      </w:pPr>
+      <w:r>
+        <w:rPr>
+          <w:lang w:val="en-ZA"/>
+        </w:rPr>
+        <w:t>I completed this Capstone independently, handling all aspects</w:t>
+      </w:r>
+      <w:r>
+        <w:rPr>
+          <w:lang w:val="en-ZA"/>
+        </w:rPr>
+        <w:t xml:space="preserve">, including strategic analysis, data preparation, exploratory analysis, the </w:t>
+      </w:r>
+      <w:proofErr w:type="spellStart"/>
+      <w:r>
+        <w:rPr>
+          <w:lang w:val="en-ZA"/>
+        </w:rPr>
+        <w:t>modeling</w:t>
+      </w:r>
+      <w:proofErr w:type="spellEnd"/>
+      <w:r>
+        <w:rPr>
+          <w:lang w:val="en-ZA"/>
+        </w:rPr>
+        <w:t xml:space="preserve"> pipeline with validation, the cost-benefit model, governance provisions, the report, and the </w:t>
+      </w:r>
+      <w:r>
+        <w:rPr>
+          <w:lang w:val="en-ZA"/>
+        </w:rPr>
+        <w:t xml:space="preserve">presentation. When I utilized large language models for research and drafting, I cited their use according to </w:t>
+      </w:r>
+      <w:proofErr w:type="spellStart"/>
+      <w:r>
+        <w:rPr>
+          <w:lang w:val="en-ZA"/>
+        </w:rPr>
+        <w:t>Quantic's</w:t>
+      </w:r>
+      <w:proofErr w:type="spellEnd"/>
+      <w:r>
+        <w:rPr>
+          <w:lang w:val="en-ZA"/>
+        </w:rPr>
+        <w:t xml:space="preserve"> conventions.</w:t>
+      </w:r>
+    </w:p>
+    <w:p>
+      <w:pPr>
+        <w:pStyle w:val="BodyText"/>
+        <w:rPr>
+          <w:lang w:val="en-ZA"/>
+        </w:rPr>
+      </w:pPr>
+      <w:r>
+        <w:rPr>
+          <w:lang w:val="en-ZA"/>
+        </w:rPr>
+        <w:t xml:space="preserve">The decisions I am most willing to defend are not those that yield the best numbers. I set a success threshold—recall of 0.75—before defining the cost function to support it. After considering the economics, the optimal value was closer to 0.65, making my original criterion incorrect. I reported this discrepancy instead of simply restating the target. Additionally, I withdrew a stakeholder requirement I had previously accepted because </w:t>
+      </w:r>
+      <w:r>
+        <w:rPr>
+          <w:lang w:val="en-ZA"/>
+        </w:rPr>
+        <w:t>implementing it would have required</w:t>
+      </w:r>
+      <w:r>
+        <w:rPr>
+          <w:lang w:val="en-ZA"/>
+        </w:rPr>
+        <w:t xml:space="preserve"> creating a policy lever based on commute distance, a proxy for race that I </w:t>
+      </w:r>
+      <w:r>
+        <w:rPr>
+          <w:lang w:val="en-ZA"/>
+        </w:rPr>
+        <w:t>could not</w:t>
+      </w:r>
+      <w:r>
+        <w:rPr>
+          <w:lang w:val="en-ZA"/>
+        </w:rPr>
+        <w:t xml:space="preserve"> test with this data. Both actions made the report appear weaker on paper, but both were the right choices.</w:t>
+      </w:r>
+    </w:p>
+    <w:p>
+      <w:pPr>
+        <w:pStyle w:val="BodyText"/>
+        <w:rPr>
+          <w:b/>
+          <w:bCs/>
+          <w:lang w:val="en-ZA"/>
+        </w:rPr>
+      </w:pPr>
+      <w:r>
+        <w:rPr>
+          <w:b/>
+          <w:bCs/>
+          <w:lang w:val="en-ZA"/>
+        </w:rPr>
+        <w:t>What I learned about analytics</w:t>
+      </w:r>
+    </w:p>
+    <w:p>
+      <w:pPr>
+        <w:pStyle w:val="BodyText"/>
+        <w:rPr>
+          <w:lang w:val="en-ZA"/>
+        </w:rPr>
+      </w:pPr>
+      <w:r>
+        <w:rPr>
+          <w:lang w:val="en-ZA"/>
+        </w:rPr>
+        <w:t>The key insight was that the model produced only a small portion of the actual financial answer. With different assumptions about intervention effectiveness, the projected return varied from 18% to 136%. When considering the observation-window assumption, which the data could not definitively resolve, the return ranged from +77% to −41%. The classifier's role in explaining this variance was relatively minor.</w:t>
+      </w:r>
+    </w:p>
+    <w:p>
+      <w:pPr>
+        <w:pStyle w:val="BodyText"/>
+        <w:rPr>
+          <w:lang w:val="en-ZA"/>
+        </w:rPr>
+      </w:pPr>
+      <w:r>
+        <w:rPr>
+          <w:lang w:val="en-ZA"/>
+        </w:rPr>
+        <w:t xml:space="preserve">This reevaluated the project approach. The model acts as a sensor that extends lead time. It </w:t>
+      </w:r>
+      <w:r>
+        <w:rPr>
+          <w:lang w:val="en-ZA"/>
+        </w:rPr>
+        <w:t>does not</w:t>
+      </w:r>
+      <w:r>
+        <w:rPr>
+          <w:lang w:val="en-ZA"/>
+        </w:rPr>
+        <w:t xml:space="preserve"> directly reduce costs; cost savings </w:t>
+      </w:r>
+      <w:r>
+        <w:rPr>
+          <w:lang w:val="en-ZA"/>
+        </w:rPr>
+        <w:t xml:space="preserve">occur only if the actions enabled by that lead time prevent failures and cost less </w:t>
+      </w:r>
+      <w:r>
+        <w:rPr>
+          <w:lang w:val="en-ZA"/>
+        </w:rPr>
+        <w:t xml:space="preserve">than the potential damage. This concept aligns with condition-based maintenance, which I </w:t>
+      </w:r>
+      <w:r>
+        <w:rPr>
+          <w:lang w:val="en-ZA"/>
+        </w:rPr>
+        <w:t>already know</w:t>
+      </w:r>
+      <w:r>
+        <w:rPr>
+          <w:lang w:val="en-ZA"/>
+        </w:rPr>
+        <w:t xml:space="preserve"> professionally. I only recognized this similarity </w:t>
+      </w:r>
+      <w:proofErr w:type="gramStart"/>
+      <w:r>
+        <w:rPr>
+          <w:lang w:val="en-ZA"/>
+        </w:rPr>
+        <w:t>later on</w:t>
+      </w:r>
+      <w:proofErr w:type="gramEnd"/>
+      <w:r>
+        <w:rPr>
+          <w:lang w:val="en-ZA"/>
+        </w:rPr>
+        <w:t xml:space="preserve">. An anomaly detection algorithm on a compressor </w:t>
+      </w:r>
+      <w:r>
+        <w:rPr>
+          <w:lang w:val="en-ZA"/>
+        </w:rPr>
+        <w:t>does not</w:t>
+      </w:r>
+      <w:r>
+        <w:rPr>
+          <w:lang w:val="en-ZA"/>
+        </w:rPr>
+        <w:t xml:space="preserve"> </w:t>
+      </w:r>
+      <w:r>
+        <w:rPr>
+          <w:lang w:val="en-ZA"/>
+        </w:rPr>
+        <w:t>prevent failures; it just offers a chance to intervene</w:t>
+      </w:r>
+      <w:r>
+        <w:rPr>
+          <w:lang w:val="en-ZA"/>
+        </w:rPr>
+        <w:t xml:space="preserve">. I used to see the model as the </w:t>
+      </w:r>
+      <w:proofErr w:type="gramStart"/>
+      <w:r>
+        <w:rPr>
+          <w:lang w:val="en-ZA"/>
+        </w:rPr>
+        <w:t>end product</w:t>
+      </w:r>
+      <w:proofErr w:type="gramEnd"/>
+      <w:r>
+        <w:rPr>
+          <w:lang w:val="en-ZA"/>
+        </w:rPr>
+        <w:t>, but now I realize that the decision framework surrounding it is what truly matters.</w:t>
+      </w:r>
+    </w:p>
+    <w:p>
+      <w:pPr>
+        <w:pStyle w:val="BodyText"/>
+        <w:rPr>
+          <w:lang w:val="en-ZA"/>
+        </w:rPr>
+      </w:pPr>
+      <w:r>
+        <w:rPr>
+          <w:lang w:val="en-ZA"/>
+        </w:rPr>
+        <w:t xml:space="preserve">The second lesson was methodological. I first used the same partition to set my decision threshold and report performance, which caused data leakage that I </w:t>
+      </w:r>
+      <w:r>
+        <w:rPr>
+          <w:lang w:val="en-ZA"/>
+        </w:rPr>
+        <w:t>did not</w:t>
+      </w:r>
+      <w:r>
+        <w:rPr>
+          <w:lang w:val="en-ZA"/>
+        </w:rPr>
+        <w:t xml:space="preserve"> notice. Reworking the process into nested cross-validation eliminated this bias and, unexpectedly, enhanced the measured performance, since each record could be used for both selection and evaluation. Rigor and results can align.</w:t>
+      </w:r>
+    </w:p>
+    <w:p>
+      <w:pPr>
+        <w:pStyle w:val="BodyText"/>
+        <w:rPr>
+          <w:b/>
+          <w:bCs/>
+          <w:lang w:val="en-ZA"/>
+        </w:rPr>
+      </w:pPr>
+      <w:r>
+        <w:rPr>
+          <w:b/>
+          <w:bCs/>
+          <w:lang w:val="en-ZA"/>
+        </w:rPr>
+        <w:t>What I learned about myself</w:t>
+      </w:r>
+    </w:p>
+    <w:p>
+      <w:pPr>
+        <w:pStyle w:val="BodyText"/>
+        <w:rPr>
+          <w:lang w:val="en-ZA"/>
+        </w:rPr>
+      </w:pPr>
+      <w:r>
+        <w:rPr>
+          <w:lang w:val="en-ZA"/>
+        </w:rPr>
+        <w:t xml:space="preserve">Balancing work and study </w:t>
+      </w:r>
+      <w:proofErr w:type="gramStart"/>
+      <w:r>
+        <w:rPr>
+          <w:lang w:val="en-ZA"/>
+        </w:rPr>
+        <w:t>has</w:t>
+      </w:r>
+      <w:proofErr w:type="gramEnd"/>
+      <w:r>
+        <w:rPr>
+          <w:lang w:val="en-ZA"/>
+        </w:rPr>
+        <w:t xml:space="preserve"> been </w:t>
+      </w:r>
+      <w:r>
+        <w:rPr>
+          <w:lang w:val="en-ZA"/>
+        </w:rPr>
+        <w:t>my most challenging experience</w:t>
+      </w:r>
+      <w:r>
+        <w:rPr>
+          <w:lang w:val="en-ZA"/>
+        </w:rPr>
+        <w:t>. Interestingly, even though I completed a chemical engineering degree—a field known for its demanding nature—</w:t>
+      </w:r>
+      <w:r>
+        <w:rPr>
+          <w:lang w:val="en-ZA"/>
+        </w:rPr>
+        <w:t>it was still harder because it was not about intellectual challenge; it was</w:t>
+      </w:r>
+      <w:r>
+        <w:rPr>
+          <w:lang w:val="en-ZA"/>
+        </w:rPr>
+        <w:t xml:space="preserve"> about juggling multiple responsibilities at the same time.</w:t>
+      </w:r>
+    </w:p>
+    <w:p>
+      <w:pPr>
+        <w:pStyle w:val="BodyText"/>
+        <w:rPr>
+          <w:lang w:val="en-ZA"/>
+        </w:rPr>
+      </w:pPr>
+      <w:r>
+        <w:rPr>
+          <w:lang w:val="en-ZA"/>
+        </w:rPr>
+        <w:lastRenderedPageBreak/>
+        <w:t xml:space="preserve">Amidst changing job duties, travel, on-site hours, and personal shifts, my focus and discipline were challenged more than expected. Unlike a full-time student who can </w:t>
+      </w:r>
+      <w:r>
+        <w:rPr>
+          <w:lang w:val="en-ZA"/>
+        </w:rPr>
+        <w:t>make studies their weekly priority, I did not have that flexibility</w:t>
+      </w:r>
+      <w:r>
+        <w:rPr>
+          <w:lang w:val="en-ZA"/>
+        </w:rPr>
+        <w:t xml:space="preserve">. The </w:t>
+      </w:r>
+      <w:r>
+        <w:rPr>
+          <w:lang w:val="en-ZA"/>
+        </w:rPr>
+        <w:t>program required more than analytical skill; it demanded the ability to make steady progress in segments, return to</w:t>
+      </w:r>
+      <w:r>
+        <w:rPr>
+          <w:lang w:val="en-ZA"/>
+        </w:rPr>
+        <w:t xml:space="preserve"> tough work after breaks, and understand that steady effort outweighs intensity.</w:t>
+      </w:r>
+    </w:p>
+    <w:p>
+      <w:pPr>
+        <w:pStyle w:val="BodyText"/>
+        <w:rPr>
+          <w:lang w:val="en-ZA"/>
+        </w:rPr>
+      </w:pPr>
+      <w:r>
+        <w:rPr>
+          <w:lang w:val="en-ZA"/>
+        </w:rPr>
+        <w:t>Honesty is essential for one key outcome. I missed the academic check-ins at Weeks 26 and 46, which served as external reviews. Working solo, I relied solely on them, and I only realized this mistake when I noticed I was using structured self-review as a substitute for another set of external eyes. If I could change one thing, it would be that.</w:t>
+      </w:r>
+    </w:p>
+    <w:p>
+      <w:pPr>
+        <w:pStyle w:val="BodyText"/>
+        <w:rPr>
+          <w:b/>
+          <w:bCs/>
+          <w:lang w:val="en-ZA"/>
+        </w:rPr>
+      </w:pPr>
+      <w:r>
+        <w:rPr>
+          <w:b/>
+          <w:bCs/>
+          <w:lang w:val="en-ZA"/>
+        </w:rPr>
+        <w:t>Professional value</w:t>
+      </w:r>
+    </w:p>
+    <w:p>
+      <w:pPr>
+        <w:pStyle w:val="BodyText"/>
+        <w:rPr>
+          <w:lang w:val="en-ZA"/>
+        </w:rPr>
+      </w:pPr>
+      <w:r>
+        <w:rPr>
+          <w:lang w:val="en-ZA"/>
+        </w:rPr>
+        <w:t xml:space="preserve">The coursework has proven valuable, especially as data analytics becomes more integral to reliability and asset management engineering. Integrating real-world problems into the program and applying </w:t>
+      </w:r>
+      <w:r>
+        <w:rPr>
+          <w:lang w:val="en-ZA"/>
+        </w:rPr>
+        <w:t>what I learned</w:t>
+      </w:r>
+      <w:r>
+        <w:rPr>
+          <w:lang w:val="en-ZA"/>
+        </w:rPr>
+        <w:t xml:space="preserve"> has been the most rewarding aspect of my degree. This project exemplified that integration, and I plan to continue utilizing this framework: leverage existing tools, demonstrate their value through a limited pilot, and maintain human judgment in decision-making.</w:t>
+      </w:r>
+    </w:p>
+    <w:p>
+      <w:pPr>
+        <w:pStyle w:val="BodyText"/>
+      </w:pPr>
+    </w:p>
+    <w:p>
+      <w:pPr>
+        <w:pStyle w:val="BodyText"/>
+      </w:pPr>
+    </w:p>
+    <w:p>
+      <w:pPr>
+        <w:pStyle w:val="BodyText"/>
+      </w:pPr>
     </w:p>
     <w:sectPr>
       <w:pgSz w:w="12240" w:h="15840"/>
@@ -26088,14 +27327,7 @@
           <w:sz w:val="20"/>
           <w:szCs w:val="20"/>
         </w:rPr>
-        <w:t>T</w:t>
-      </w:r>
-      <w:r>
-        <w:rPr>
-          <w:sz w:val="20"/>
-          <w:szCs w:val="20"/>
-        </w:rPr>
-        <w:t>he triage budget's scope and limitations are clarified. The EDA shows that overtime is the main factor, followed by stagnant promotions and manager tenure. A one-time bonus cannot resolve these issues, and the report makes no such claim.</w:t>
+        <w:t>The triage budget's scope and limitations are clarified. The EDA shows that overtime is the main factor, followed by stagnant promotions and manager tenure. A one-time bonus cannot resolve these issues, and the report makes no such claim.</w:t>
       </w:r>
     </w:p>
   </w:footnote>
@@ -27032,7 +28264,6 @@
   <w:style w:type="character" w:default="1" w:styleId="DefaultParagraphFont">
     <w:name w:val="Default Paragraph Font"/>
     <w:uiPriority w:val="1"/>
-    <w:semiHidden/>
     <w:unhideWhenUsed/>
   </w:style>
   <w:style w:type="table" w:default="1" w:styleId="TableNormal">

</xml_diff>